<commit_message>
Restringe permisos y mejora bitácoras de contratos
</commit_message>
<xml_diff>
--- a/src/main/resources/templates/docgen/3/3.-FORMATO PROPUESTA DE SERVICIOS NOMS.docx
+++ b/src/main/resources/templates/docgen/3/3.-FORMATO PROPUESTA DE SERVICIOS NOMS.docx
@@ -1,13 +1,13 @@
 
 <file path=word/document.xml><?xml version="1.0" encoding="utf-8"?>
-<w:document xmlns:wpc="http://schemas.microsoft.com/office/word/2010/wordprocessingCanvas" xmlns:cx="http://schemas.microsoft.com/office/drawing/2014/chartex" xmlns:cx1="http://schemas.microsoft.com/office/drawing/2015/9/8/chartex" xmlns:cx2="http://schemas.microsoft.com/office/drawing/2015/10/21/chartex" xmlns:cx3="http://schemas.microsoft.com/office/drawing/2016/5/9/chartex" xmlns:cx4="http://schemas.microsoft.com/office/drawing/2016/5/10/chartex" xmlns:cx5="http://schemas.microsoft.com/office/drawing/2016/5/11/chartex" xmlns:cx6="http://schemas.microsoft.com/office/drawing/2016/5/12/chartex" xmlns:cx7="http://schemas.microsoft.com/office/drawing/2016/5/13/chartex" xmlns:cx8="http://schemas.microsoft.com/office/drawing/2016/5/14/chartex" xmlns:mc="http://schemas.openxmlformats.org/markup-compatibility/2006" xmlns:aink="http://schemas.microsoft.com/office/drawing/2016/ink" xmlns:am3d="http://schemas.microsoft.com/office/drawing/2017/model3d" xmlns:o="urn:schemas-microsoft-com:office:office" xmlns:oel="http://schemas.microsoft.com/office/2019/extlst" xmlns:r="http://schemas.openxmlformats.org/officeDocument/2006/relationships" xmlns:m="http://schemas.openxmlformats.org/officeDocument/2006/math" xmlns:v="urn:schemas-microsoft-com:vml" xmlns:wp14="http://schemas.microsoft.com/office/word/2010/wordprocessingDrawing" xmlns:wp="http://schemas.openxmlformats.org/drawingml/2006/wordprocessingDrawing" xmlns:w10="urn:schemas-microsoft-com:office:word" xmlns:w="http://schemas.openxmlformats.org/wordprocessingml/2006/main" xmlns:w14="http://schemas.microsoft.com/office/word/2010/wordml" xmlns:w15="http://schemas.microsoft.com/office/word/2012/wordml" xmlns:w16cex="http://schemas.microsoft.com/office/word/2018/wordml/cex" xmlns:w16cid="http://schemas.microsoft.com/office/word/2016/wordml/cid" xmlns:w16="http://schemas.microsoft.com/office/word/2018/wordml" xmlns:w16du="http://schemas.microsoft.com/office/word/2023/wordml/word16du" xmlns:w16sdtdh="http://schemas.microsoft.com/office/word/2020/wordml/sdtdatahash" xmlns:w16sdtfl="http://schemas.microsoft.com/office/word/2024/wordml/sdtformatlock" xmlns:w16se="http://schemas.microsoft.com/office/word/2015/wordml/symex" xmlns:wpg="http://schemas.microsoft.com/office/word/2010/wordprocessingGroup" xmlns:wpi="http://schemas.microsoft.com/office/word/2010/wordprocessingInk" xmlns:wne="http://schemas.microsoft.com/office/word/2006/wordml" xmlns:wps="http://schemas.microsoft.com/office/word/2010/wordprocessingShape" mc:Ignorable="w14 w15 w16se w16cid w16 w16cex w16sdtdh w16sdtfl w16du wp14">
+<w:document xmlns:wpc="http://schemas.microsoft.com/office/word/2010/wordprocessingCanvas" xmlns:mc="http://schemas.openxmlformats.org/markup-compatibility/2006" xmlns:o="urn:schemas-microsoft-com:office:office" xmlns:r="http://schemas.openxmlformats.org/officeDocument/2006/relationships" xmlns:m="http://schemas.openxmlformats.org/officeDocument/2006/math" xmlns:v="urn:schemas-microsoft-com:vml" xmlns:wp14="http://schemas.microsoft.com/office/word/2010/wordprocessingDrawing" xmlns:wp="http://schemas.openxmlformats.org/drawingml/2006/wordprocessingDrawing" xmlns:w10="urn:schemas-microsoft-com:office:word" xmlns:w="http://schemas.openxmlformats.org/wordprocessingml/2006/main" xmlns:w14="http://schemas.microsoft.com/office/word/2010/wordml" xmlns:w15="http://schemas.microsoft.com/office/word/2012/wordml" xmlns:w16se="http://schemas.microsoft.com/office/word/2015/wordml/symex" xmlns:w16cid="http://schemas.microsoft.com/office/word/2016/wordml/cid" xmlns:w16="http://schemas.microsoft.com/office/word/2018/wordml" xmlns:w16cex="http://schemas.microsoft.com/office/word/2018/wordml/cex" xmlns:w16sdtdh="http://schemas.microsoft.com/office/word/2020/wordml/sdtdatahash" xmlns:wne="http://schemas.microsoft.com/office/word/2006/wordml" xmlns:wpg="http://schemas.microsoft.com/office/word/2010/wordprocessingGroup" xmlns:wps="http://schemas.microsoft.com/office/word/2010/wordprocessingShape" mc:Ignorable="w14 w15 w16se w16cid w16 w16cex w16sdtdh wp14">
   <w:body>
     <w:p>
       <w:pPr>
         <w:spacing w:after="0" w:line="240" w:lineRule="auto"/>
         <w:jc w:val="right"/>
         <w:rPr>
-          <w:rFonts w:ascii="Arial" w:eastAsia="Times New Roman" w:hAnsi="Arial" w:cs="Arial"/>
+          <w:rFonts w:ascii="Arial" w:hAnsi="Arial" w:eastAsia="Times New Roman" w:cs="Arial"/>
           <w:color w:val="FF0000"/>
           <w:sz w:val="24"/>
           <w:szCs w:val="24"/>
@@ -15,7 +15,7 @@
       </w:pPr>
       <w:r>
         <w:rPr>
-          <w:rFonts w:ascii="Arial" w:eastAsia="Times New Roman" w:hAnsi="Arial" w:cs="Arial"/>
+          <w:rFonts w:ascii="Arial" w:hAnsi="Arial" w:eastAsia="Times New Roman" w:cs="Arial"/>
           <w:color w:val="000000"/>
           <w:sz w:val="24"/>
           <w:szCs w:val="24"/>
@@ -24,7 +24,7 @@
       </w:r>
       <w:r>
         <w:rPr>
-          <w:rFonts w:ascii="Arial" w:eastAsia="Times New Roman" w:hAnsi="Arial" w:cs="Arial"/>
+          <w:rFonts w:ascii="Arial" w:hAnsi="Arial" w:eastAsia="Times New Roman" w:cs="Arial"/>
           <w:color w:val="FF0000"/>
           <w:sz w:val="24"/>
           <w:szCs w:val="24"/>
@@ -33,7 +33,7 @@
       </w:r>
       <w:r>
         <w:rPr>
-          <w:rFonts w:ascii="Arial" w:eastAsia="Times New Roman" w:hAnsi="Arial" w:cs="Arial"/>
+          <w:rFonts w:ascii="Arial" w:hAnsi="Arial" w:eastAsia="Times New Roman" w:cs="Arial"/>
           <w:color w:val="FF0000"/>
           <w:sz w:val="24"/>
           <w:szCs w:val="24"/>
@@ -42,7 +42,7 @@
       </w:r>
       <w:r>
         <w:rPr>
-          <w:rFonts w:ascii="Arial" w:eastAsia="Times New Roman" w:hAnsi="Arial" w:cs="Arial"/>
+          <w:rFonts w:ascii="Arial" w:hAnsi="Arial" w:eastAsia="Times New Roman" w:cs="Arial"/>
           <w:color w:val="FF0000"/>
           <w:sz w:val="24"/>
           <w:szCs w:val="24"/>
@@ -51,7 +51,7 @@
       </w:r>
       <w:r>
         <w:rPr>
-          <w:rFonts w:ascii="Arial" w:eastAsia="Times New Roman" w:hAnsi="Arial" w:cs="Arial"/>
+          <w:rFonts w:ascii="Arial" w:hAnsi="Arial" w:eastAsia="Times New Roman" w:cs="Arial"/>
           <w:color w:val="000000"/>
           <w:sz w:val="24"/>
           <w:szCs w:val="24"/>
@@ -60,7 +60,7 @@
       </w:r>
       <w:r>
         <w:rPr>
-          <w:rFonts w:ascii="Arial" w:eastAsia="Times New Roman" w:hAnsi="Arial" w:cs="Arial"/>
+          <w:rFonts w:ascii="Arial" w:hAnsi="Arial" w:eastAsia="Times New Roman" w:cs="Arial"/>
           <w:color w:val="FF0000"/>
           <w:sz w:val="24"/>
           <w:szCs w:val="24"/>
@@ -69,7 +69,7 @@
       </w:r>
       <w:r>
         <w:rPr>
-          <w:rFonts w:ascii="Arial" w:eastAsia="Times New Roman" w:hAnsi="Arial" w:cs="Arial"/>
+          <w:rFonts w:ascii="Arial" w:hAnsi="Arial" w:eastAsia="Times New Roman" w:cs="Arial"/>
           <w:color w:val="FF0000"/>
           <w:sz w:val="24"/>
           <w:szCs w:val="24"/>
@@ -78,7 +78,7 @@
       </w:r>
       <w:r>
         <w:rPr>
-          <w:rFonts w:ascii="Arial" w:eastAsia="Times New Roman" w:hAnsi="Arial" w:cs="Arial"/>
+          <w:rFonts w:ascii="Arial" w:hAnsi="Arial" w:eastAsia="Times New Roman" w:cs="Arial"/>
           <w:color w:val="FF0000"/>
           <w:sz w:val="24"/>
           <w:szCs w:val="24"/>
@@ -87,7 +87,7 @@
       </w:r>
       <w:r>
         <w:rPr>
-          <w:rFonts w:ascii="Arial" w:eastAsia="Times New Roman" w:hAnsi="Arial" w:cs="Arial"/>
+          <w:rFonts w:ascii="Arial" w:hAnsi="Arial" w:eastAsia="Times New Roman" w:cs="Arial"/>
           <w:color w:val="FF0000"/>
           <w:sz w:val="24"/>
           <w:szCs w:val="24"/>
@@ -96,7 +96,7 @@
       </w:r>
       <w:r>
         <w:rPr>
-          <w:rFonts w:ascii="Arial" w:eastAsia="Times New Roman" w:hAnsi="Arial" w:cs="Arial"/>
+          <w:rFonts w:ascii="Arial" w:hAnsi="Arial" w:eastAsia="Times New Roman" w:cs="Arial"/>
           <w:color w:val="000000"/>
           <w:sz w:val="24"/>
           <w:szCs w:val="24"/>
@@ -105,7 +105,7 @@
       </w:r>
       <w:r>
         <w:rPr>
-          <w:rFonts w:ascii="Arial" w:eastAsia="Times New Roman" w:hAnsi="Arial" w:cs="Arial"/>
+          <w:rFonts w:ascii="Arial" w:hAnsi="Arial" w:eastAsia="Times New Roman" w:cs="Arial"/>
           <w:color w:val="FF0000"/>
           <w:sz w:val="24"/>
           <w:szCs w:val="24"/>
@@ -114,7 +114,7 @@
       </w:r>
       <w:r>
         <w:rPr>
-          <w:rFonts w:ascii="Arial" w:eastAsia="Times New Roman" w:hAnsi="Arial" w:cs="Arial"/>
+          <w:rFonts w:ascii="Arial" w:hAnsi="Arial" w:eastAsia="Times New Roman" w:cs="Arial"/>
           <w:color w:val="FF0000"/>
           <w:sz w:val="24"/>
           <w:szCs w:val="24"/>
@@ -123,7 +123,7 @@
       </w:r>
       <w:r>
         <w:rPr>
-          <w:rFonts w:ascii="Arial" w:eastAsia="Times New Roman" w:hAnsi="Arial" w:cs="Arial"/>
+          <w:rFonts w:ascii="Arial" w:hAnsi="Arial" w:eastAsia="Times New Roman" w:cs="Arial"/>
           <w:color w:val="FF0000"/>
           <w:sz w:val="24"/>
           <w:szCs w:val="24"/>
@@ -136,7 +136,7 @@
         <w:spacing w:after="0" w:line="240" w:lineRule="auto"/>
         <w:jc w:val="both"/>
         <w:rPr>
-          <w:rFonts w:ascii="Arial" w:eastAsia="Times New Roman" w:hAnsi="Arial" w:cs="Arial"/>
+          <w:rFonts w:ascii="Arial" w:hAnsi="Arial" w:eastAsia="Times New Roman" w:cs="Arial"/>
           <w:color w:val="000000"/>
           <w:sz w:val="24"/>
           <w:szCs w:val="24"/>
@@ -148,7 +148,7 @@
         <w:spacing w:after="0" w:line="240" w:lineRule="auto"/>
         <w:jc w:val="both"/>
         <w:rPr>
-          <w:rFonts w:ascii="Arial" w:eastAsia="Times New Roman" w:hAnsi="Arial" w:cs="Arial"/>
+          <w:rFonts w:ascii="Arial" w:hAnsi="Arial" w:eastAsia="Times New Roman" w:cs="Arial"/>
           <w:color w:val="000000"/>
           <w:sz w:val="24"/>
           <w:szCs w:val="24"/>
@@ -160,7 +160,7 @@
         <w:spacing w:after="0" w:line="240" w:lineRule="auto"/>
         <w:jc w:val="center"/>
         <w:rPr>
-          <w:rFonts w:ascii="Arial" w:eastAsia="Times New Roman" w:hAnsi="Arial" w:cs="Arial"/>
+          <w:rFonts w:ascii="Arial" w:hAnsi="Arial" w:eastAsia="Times New Roman" w:cs="Arial"/>
           <w:b/>
           <w:bCs/>
           <w:color w:val="000000"/>
@@ -175,7 +175,7 @@
         <w:spacing w:after="0" w:line="240" w:lineRule="auto"/>
         <w:jc w:val="center"/>
         <w:rPr>
-          <w:rFonts w:ascii="Arial" w:eastAsia="Times New Roman" w:hAnsi="Arial" w:cs="Arial"/>
+          <w:rFonts w:ascii="Arial" w:hAnsi="Arial" w:eastAsia="Times New Roman" w:cs="Arial"/>
           <w:b/>
           <w:bCs/>
           <w:color w:val="000000"/>
@@ -186,7 +186,7 @@
       </w:pPr>
       <w:r>
         <w:rPr>
-          <w:rFonts w:ascii="Arial" w:eastAsia="Times New Roman" w:hAnsi="Arial" w:cs="Arial"/>
+          <w:rFonts w:ascii="Arial" w:hAnsi="Arial" w:eastAsia="Times New Roman" w:cs="Arial"/>
           <w:b/>
           <w:bCs/>
           <w:color w:val="000000"/>
@@ -202,7 +202,7 @@
         <w:spacing w:after="0" w:line="240" w:lineRule="auto"/>
         <w:jc w:val="both"/>
         <w:rPr>
-          <w:rFonts w:ascii="Arial" w:eastAsia="Times New Roman" w:hAnsi="Arial" w:cs="Arial"/>
+          <w:rFonts w:ascii="Arial" w:hAnsi="Arial" w:eastAsia="Times New Roman" w:cs="Arial"/>
           <w:color w:val="000000"/>
           <w:sz w:val="24"/>
           <w:szCs w:val="24"/>
@@ -214,7 +214,7 @@
         <w:spacing w:after="0" w:line="240" w:lineRule="auto"/>
         <w:jc w:val="both"/>
         <w:rPr>
-          <w:rFonts w:ascii="Arial" w:eastAsia="Times New Roman" w:hAnsi="Arial" w:cs="Arial"/>
+          <w:rFonts w:ascii="Arial" w:hAnsi="Arial" w:eastAsia="Times New Roman" w:cs="Arial"/>
           <w:color w:val="000000"/>
           <w:sz w:val="24"/>
           <w:szCs w:val="24"/>
@@ -226,7 +226,7 @@
         <w:spacing w:after="0" w:line="240" w:lineRule="auto"/>
         <w:jc w:val="both"/>
         <w:rPr>
-          <w:rFonts w:ascii="Arial" w:eastAsia="Times New Roman" w:hAnsi="Arial" w:cs="Arial"/>
+          <w:rFonts w:ascii="Arial" w:hAnsi="Arial" w:eastAsia="Times New Roman" w:cs="Arial"/>
           <w:b/>
           <w:bCs/>
           <w:color w:val="000000"/>
@@ -235,97 +235,70 @@
         </w:rPr>
       </w:pPr>
       <w:r>
-        <w:rPr>
-          <w:rFonts w:ascii="Arial" w:eastAsia="Times New Roman" w:hAnsi="Arial" w:cs="Arial"/>
-          <w:b/>
-          <w:bCs/>
-          <w:color w:val="000000"/>
-          <w:sz w:val="24"/>
-          <w:szCs w:val="24"/>
-        </w:rPr>
-        <w:t>XXXXXXX</w:t>
+        <w:t xml:space="preserve">  </w:t>
       </w:r>
     </w:p>
     <w:p>
       <w:pPr>
-        <w:spacing w:after="0" w:line="240" w:lineRule="auto"/>
+        <w:spacing w:line="240" w:lineRule="auto"/>
         <w:jc w:val="both"/>
-        <w:rPr>
-          <w:rFonts w:ascii="Arial" w:eastAsia="Times New Roman" w:hAnsi="Arial" w:cs="Arial"/>
-          <w:b/>
-          <w:bCs/>
-          <w:color w:val="000000"/>
-          <w:sz w:val="24"/>
-          <w:szCs w:val="24"/>
-        </w:rPr>
-      </w:pPr>
-      <w:r>
-        <w:rPr>
-          <w:rFonts w:ascii="Arial" w:eastAsia="Times New Roman" w:hAnsi="Arial" w:cs="Arial"/>
-          <w:b/>
-          <w:bCs/>
-          <w:color w:val="000000"/>
-          <w:sz w:val="24"/>
-          <w:szCs w:val="24"/>
-        </w:rPr>
-        <w:t xml:space="preserve">Dir. </w:t>
-      </w:r>
-      <w:r>
-        <w:rPr>
-          <w:rFonts w:ascii="Arial" w:eastAsia="Times New Roman" w:hAnsi="Arial" w:cs="Arial"/>
-          <w:b/>
-          <w:bCs/>
-          <w:color w:val="000000"/>
-          <w:sz w:val="24"/>
-          <w:szCs w:val="24"/>
-        </w:rPr>
-        <w:t>xxxxxxx</w:t>
-      </w:r>
-    </w:p>
-    <w:p>
-      <w:pPr>
-        <w:spacing w:after="0" w:line="240" w:lineRule="auto"/>
-        <w:jc w:val="both"/>
-        <w:rPr>
-          <w:rFonts w:ascii="Arial" w:eastAsia="Times New Roman" w:hAnsi="Arial" w:cs="Arial"/>
-          <w:b/>
-          <w:bCs/>
-          <w:color w:val="000000"/>
-          <w:sz w:val="24"/>
-          <w:szCs w:val="24"/>
-        </w:rPr>
-      </w:pPr>
-      <w:r>
-        <w:rPr>
-          <w:rFonts w:ascii="Arial" w:eastAsia="Times New Roman" w:hAnsi="Arial" w:cs="Arial"/>
+      </w:pPr>
+      <w:r>
+        <w:rPr>
+          <w:rFonts w:ascii="Arial" w:hAnsi="Arial" w:cs="Arial"/>
           <w:b/>
           <w:bCs/>
           <w:color w:val="FF0000"/>
           <w:sz w:val="24"/>
           <w:szCs w:val="24"/>
         </w:rPr>
-        <w:t>{{NOMBRE</w:t>
-      </w:r>
-      <w:r>
-        <w:rPr>
-          <w:rFonts w:ascii="Arial" w:eastAsia="Times New Roman" w:hAnsi="Arial" w:cs="Arial"/>
+        <w:t>{{REPRESENTADA_POR}}</w:t>
+      </w:r>
+    </w:p>
+    <w:p>
+      <w:pPr>
+        <w:spacing w:after="0" w:line="240" w:lineRule="auto"/>
+        <w:jc w:val="both"/>
+        <w:rPr>
+          <w:rFonts w:ascii="Arial" w:hAnsi="Arial" w:eastAsia="Times New Roman" w:cs="Arial"/>
+          <w:b/>
+          <w:bCs/>
+          <w:color w:val="000000"/>
+          <w:sz w:val="24"/>
+          <w:szCs w:val="24"/>
+        </w:rPr>
+      </w:pPr>
+      <w:r>
+        <w:rPr>
+          <w:rFonts w:ascii="Arial" w:hAnsi="Arial" w:eastAsia="Times New Roman" w:cs="Arial"/>
           <w:b/>
           <w:bCs/>
           <w:color w:val="FF0000"/>
           <w:sz w:val="24"/>
           <w:szCs w:val="24"/>
         </w:rPr>
-        <w:t>_</w:t>
-      </w:r>
-      <w:r>
-        <w:rPr>
-          <w:rFonts w:ascii="Arial" w:eastAsia="Times New Roman" w:hAnsi="Arial" w:cs="Arial"/>
+        <w:t>{{NOMBRE</w:t>
+      </w:r>
+      <w:r>
+        <w:rPr>
+          <w:rFonts w:ascii="Arial" w:hAnsi="Arial" w:eastAsia="Times New Roman" w:cs="Arial"/>
           <w:b/>
           <w:bCs/>
           <w:color w:val="FF0000"/>
           <w:sz w:val="24"/>
           <w:szCs w:val="24"/>
         </w:rPr>
+        <w:t>_</w:t>
+      </w:r>
+      <w:r>
+        <w:rPr>
+          <w:rFonts w:ascii="Arial" w:hAnsi="Arial" w:eastAsia="Times New Roman" w:cs="Arial"/>
+          <w:b/>
+          <w:bCs/>
+          <w:color w:val="FF0000"/>
+          <w:sz w:val="24"/>
+          <w:szCs w:val="24"/>
+        </w:rPr>
         <w:t>EMPRESA}}</w:t>
       </w:r>
     </w:p>
@@ -334,7 +307,7 @@
         <w:spacing w:after="0" w:line="240" w:lineRule="auto"/>
         <w:jc w:val="both"/>
         <w:rPr>
-          <w:rFonts w:ascii="Arial" w:eastAsia="Times New Roman" w:hAnsi="Arial" w:cs="Arial"/>
+          <w:rFonts w:ascii="Arial" w:hAnsi="Arial" w:eastAsia="Times New Roman" w:cs="Arial"/>
           <w:color w:val="000000"/>
           <w:sz w:val="24"/>
           <w:szCs w:val="24"/>
@@ -346,15 +319,15 @@
         <w:spacing w:after="0" w:line="240" w:lineRule="auto"/>
         <w:jc w:val="both"/>
         <w:rPr>
-          <w:rFonts w:ascii="Arial" w:eastAsia="Times New Roman" w:hAnsi="Arial" w:cs="Arial"/>
-          <w:color w:val="000000"/>
-          <w:sz w:val="24"/>
-          <w:szCs w:val="24"/>
-        </w:rPr>
-      </w:pPr>
-      <w:r>
-        <w:rPr>
-          <w:rFonts w:ascii="Arial" w:eastAsia="Times New Roman" w:hAnsi="Arial" w:cs="Arial"/>
+          <w:rFonts w:ascii="Arial" w:hAnsi="Arial" w:eastAsia="Times New Roman" w:cs="Arial"/>
+          <w:color w:val="000000"/>
+          <w:sz w:val="24"/>
+          <w:szCs w:val="24"/>
+        </w:rPr>
+      </w:pPr>
+      <w:r>
+        <w:rPr>
+          <w:rFonts w:ascii="Arial" w:hAnsi="Arial" w:eastAsia="Times New Roman" w:cs="Arial"/>
           <w:color w:val="000000"/>
           <w:sz w:val="24"/>
           <w:szCs w:val="24"/>
@@ -367,7 +340,7 @@
         <w:spacing w:after="0" w:line="240" w:lineRule="auto"/>
         <w:jc w:val="both"/>
         <w:rPr>
-          <w:rFonts w:ascii="Arial" w:eastAsia="Times New Roman" w:hAnsi="Arial" w:cs="Arial"/>
+          <w:rFonts w:ascii="Arial" w:hAnsi="Arial" w:eastAsia="Times New Roman" w:cs="Arial"/>
           <w:color w:val="000000"/>
           <w:sz w:val="24"/>
           <w:szCs w:val="24"/>
@@ -387,7 +360,7 @@
       </w:pPr>
       <w:r>
         <w:rPr>
-          <w:rFonts w:ascii="Arial" w:eastAsia="Times New Roman" w:hAnsi="Arial" w:cs="Arial"/>
+          <w:rFonts w:ascii="Arial" w:hAnsi="Arial" w:eastAsia="Times New Roman" w:cs="Arial"/>
           <w:color w:val="000000"/>
           <w:sz w:val="24"/>
           <w:szCs w:val="24"/>
@@ -396,89 +369,23 @@
       </w:r>
       <w:r>
         <w:rPr>
+          <w:rFonts w:ascii="Calibri" w:hAnsi="Calibri" w:cs="Calibri" w:asciiTheme="minorHAnsi" w:hAnsiTheme="minorHAnsi" w:eastAsiaTheme="minorEastAsia" w:csTheme="minorBidi"/>
           <w:b/>
           <w:bCs/>
           <w:color w:val="FF0000"/>
-        </w:rPr>
-        <w:t xml:space="preserve"> </w:t>
-      </w:r>
-      <w:r>
-        <w:rPr>
-          <w:b/>
-          <w:bCs/>
-          <w:color w:val="FF0000"/>
-        </w:rPr>
-        <w:t>{{</w:t>
-      </w:r>
-      <w:r>
-        <w:rPr>
-          <w:b/>
-          <w:bCs/>
-          <w:color w:val="FF0000"/>
-        </w:rPr>
-        <w:t>ESTIMADO</w:t>
-      </w:r>
-      <w:r>
-        <w:rPr>
-          <w:b/>
-          <w:bCs/>
-          <w:color w:val="FF0000"/>
-        </w:rPr>
-        <w:t>}}</w:t>
-      </w:r>
-      <w:r>
-        <w:rPr>
-          <w:rFonts w:ascii="Arial" w:eastAsia="Times New Roman" w:hAnsi="Arial" w:cs="Arial"/>
-          <w:color w:val="000000"/>
-          <w:sz w:val="24"/>
-          <w:szCs w:val="24"/>
-        </w:rPr>
-        <w:t>, p</w:t>
-      </w:r>
-      <w:r>
-        <w:rPr>
-          <w:rFonts w:ascii="Arial" w:eastAsia="Times New Roman" w:hAnsi="Arial" w:cs="Arial"/>
-          <w:color w:val="000000"/>
-          <w:sz w:val="24"/>
-          <w:szCs w:val="24"/>
-        </w:rPr>
-        <w:t>or medio de la presente</w:t>
-      </w:r>
-      <w:r>
-        <w:rPr>
-          <w:rFonts w:ascii="Arial" w:eastAsia="Times New Roman" w:hAnsi="Arial" w:cs="Arial"/>
-          <w:color w:val="000000"/>
-          <w:sz w:val="24"/>
-          <w:szCs w:val="24"/>
-        </w:rPr>
-        <w:t xml:space="preserve"> aprovechamos la ocasión para agradecer la </w:t>
-      </w:r>
-      <w:r>
-        <w:rPr>
-          <w:rFonts w:ascii="Arial" w:eastAsia="Times New Roman" w:hAnsi="Arial" w:cs="Arial"/>
-          <w:color w:val="000000"/>
-          <w:sz w:val="24"/>
-          <w:szCs w:val="24"/>
-        </w:rPr>
-        <w:t>oportunidad</w:t>
-      </w:r>
-      <w:r>
-        <w:rPr>
-          <w:rFonts w:ascii="Arial" w:eastAsia="Times New Roman" w:hAnsi="Arial" w:cs="Arial"/>
-          <w:color w:val="000000"/>
-          <w:sz w:val="24"/>
-          <w:szCs w:val="24"/>
-        </w:rPr>
-        <w:t xml:space="preserve"> de poner a su disposición nuestros servicios, mediante la presente</w:t>
-      </w:r>
-      <w:r>
-        <w:rPr>
-          <w:rFonts w:ascii="Arial" w:eastAsia="Times New Roman" w:hAnsi="Arial" w:cs="Arial"/>
-          <w:color w:val="000000"/>
-          <w:sz w:val="24"/>
-          <w:szCs w:val="24"/>
-        </w:rPr>
-        <w:t xml:space="preserve"> oferta de servicios que a continuación se desglosa que se incluyen en la tarifa:</w:t>
+          <w:sz w:val="22"/>
+          <w:szCs w:val="22"/>
+        </w:rPr>
+        <w:t xml:space="preserve"> {{REPRESENTADA_POR}}</w:t>
+      </w:r>
+      <w:r>
+        <w:rPr>
+          <w:rFonts w:ascii="Arial" w:hAnsi="Arial" w:eastAsia="Times New Roman" w:cs="Arial"/>
+          <w:color w:val="000000"/>
+          <w:sz w:val="24"/>
+          <w:szCs w:val="24"/>
+        </w:rPr>
+        <w:t>, por medio de la presente aprovechamos la ocasión para agradecer la oportunidad de poner a su disposición nuestros servicios, mediante la presente oferta de servicios que a continuación se desglosa que se incluyen en la tarifa:</w:t>
       </w:r>
     </w:p>
     <w:p>
@@ -486,7 +393,7 @@
         <w:spacing w:after="0" w:line="240" w:lineRule="auto"/>
         <w:jc w:val="both"/>
         <w:rPr>
-          <w:rFonts w:ascii="Arial" w:eastAsia="Times New Roman" w:hAnsi="Arial" w:cs="Arial"/>
+          <w:rFonts w:ascii="Arial" w:hAnsi="Arial" w:eastAsia="Times New Roman" w:cs="Arial"/>
           <w:color w:val="000000"/>
           <w:sz w:val="24"/>
           <w:szCs w:val="24"/>
@@ -501,17 +408,18 @@
           <w:numId w:val="20"/>
         </w:numPr>
         <w:spacing w:after="0" w:line="240" w:lineRule="auto"/>
+        <w:ind w:left="720" w:hanging="360"/>
         <w:jc w:val="both"/>
         <w:rPr>
-          <w:rFonts w:ascii="Arial" w:eastAsia="Times New Roman" w:hAnsi="Arial" w:cs="Arial"/>
-          <w:color w:val="000000"/>
-          <w:sz w:val="24"/>
-          <w:szCs w:val="24"/>
-        </w:rPr>
-      </w:pPr>
-      <w:r>
-        <w:rPr>
-          <w:rFonts w:ascii="Arial" w:eastAsia="Times New Roman" w:hAnsi="Arial" w:cs="Arial"/>
+          <w:rFonts w:ascii="Arial" w:hAnsi="Arial" w:eastAsia="Times New Roman" w:cs="Arial"/>
+          <w:color w:val="000000"/>
+          <w:sz w:val="24"/>
+          <w:szCs w:val="24"/>
+        </w:rPr>
+      </w:pPr>
+      <w:r>
+        <w:rPr>
+          <w:rFonts w:ascii="Arial" w:hAnsi="Arial" w:eastAsia="Times New Roman" w:cs="Arial"/>
           <w:color w:val="000000"/>
           <w:sz w:val="24"/>
           <w:szCs w:val="24"/>
@@ -520,7 +428,7 @@
       </w:r>
       <w:r>
         <w:rPr>
-          <w:rFonts w:ascii="Arial" w:eastAsia="Times New Roman" w:hAnsi="Arial" w:cs="Arial"/>
+          <w:rFonts w:ascii="Arial" w:hAnsi="Arial" w:eastAsia="Times New Roman" w:cs="Arial"/>
           <w:color w:val="000000"/>
           <w:sz w:val="24"/>
           <w:szCs w:val="24"/>
@@ -529,7 +437,7 @@
       </w:r>
       <w:r>
         <w:rPr>
-          <w:rFonts w:ascii="Arial" w:eastAsia="Times New Roman" w:hAnsi="Arial" w:cs="Arial"/>
+          <w:rFonts w:ascii="Arial" w:hAnsi="Arial" w:eastAsia="Times New Roman" w:cs="Arial"/>
           <w:color w:val="000000"/>
           <w:sz w:val="24"/>
           <w:szCs w:val="24"/>
@@ -538,7 +446,7 @@
       </w:r>
       <w:r>
         <w:rPr>
-          <w:rFonts w:ascii="Arial" w:eastAsia="Times New Roman" w:hAnsi="Arial" w:cs="Arial"/>
+          <w:rFonts w:ascii="Arial" w:hAnsi="Arial" w:eastAsia="Times New Roman" w:cs="Arial"/>
           <w:color w:val="000000"/>
           <w:sz w:val="24"/>
           <w:szCs w:val="24"/>
@@ -547,7 +455,7 @@
       </w:r>
       <w:r>
         <w:rPr>
-          <w:rFonts w:ascii="Arial" w:eastAsia="Times New Roman" w:hAnsi="Arial" w:cs="Arial"/>
+          <w:rFonts w:ascii="Arial" w:hAnsi="Arial" w:eastAsia="Times New Roman" w:cs="Arial"/>
           <w:color w:val="000000"/>
           <w:sz w:val="24"/>
           <w:szCs w:val="24"/>
@@ -556,7 +464,7 @@
       </w:r>
       <w:r>
         <w:rPr>
-          <w:rFonts w:ascii="Arial" w:eastAsia="Times New Roman" w:hAnsi="Arial" w:cs="Arial"/>
+          <w:rFonts w:ascii="Arial" w:hAnsi="Arial" w:eastAsia="Times New Roman" w:cs="Arial"/>
           <w:color w:val="000000"/>
           <w:sz w:val="24"/>
           <w:szCs w:val="24"/>
@@ -565,7 +473,7 @@
       </w:r>
       <w:r>
         <w:rPr>
-          <w:rFonts w:ascii="Arial" w:eastAsia="Times New Roman" w:hAnsi="Arial" w:cs="Arial"/>
+          <w:rFonts w:ascii="Arial" w:hAnsi="Arial" w:eastAsia="Times New Roman" w:cs="Arial"/>
           <w:color w:val="000000"/>
           <w:sz w:val="24"/>
           <w:szCs w:val="24"/>
@@ -574,7 +482,7 @@
       </w:r>
       <w:r>
         <w:rPr>
-          <w:rFonts w:ascii="Arial" w:eastAsia="Times New Roman" w:hAnsi="Arial" w:cs="Arial"/>
+          <w:rFonts w:ascii="Arial" w:hAnsi="Arial" w:eastAsia="Times New Roman" w:cs="Arial"/>
           <w:color w:val="000000"/>
           <w:sz w:val="24"/>
           <w:szCs w:val="24"/>
@@ -583,7 +491,7 @@
       </w:r>
       <w:r>
         <w:rPr>
-          <w:rFonts w:ascii="Arial" w:eastAsia="Times New Roman" w:hAnsi="Arial" w:cs="Arial"/>
+          <w:rFonts w:ascii="Arial" w:hAnsi="Arial" w:eastAsia="Times New Roman" w:cs="Arial"/>
           <w:color w:val="000000"/>
           <w:sz w:val="24"/>
           <w:szCs w:val="24"/>
@@ -592,7 +500,7 @@
       </w:r>
       <w:r>
         <w:rPr>
-          <w:rFonts w:ascii="Arial" w:eastAsia="Times New Roman" w:hAnsi="Arial" w:cs="Arial"/>
+          <w:rFonts w:ascii="Arial" w:hAnsi="Arial" w:eastAsia="Times New Roman" w:cs="Arial"/>
           <w:color w:val="000000"/>
           <w:sz w:val="24"/>
           <w:szCs w:val="24"/>
@@ -601,7 +509,7 @@
       </w:r>
       <w:r>
         <w:rPr>
-          <w:rFonts w:ascii="Arial" w:eastAsia="Times New Roman" w:hAnsi="Arial" w:cs="Arial"/>
+          <w:rFonts w:ascii="Arial" w:hAnsi="Arial" w:eastAsia="Times New Roman" w:cs="Arial"/>
           <w:color w:val="000000"/>
           <w:sz w:val="24"/>
           <w:szCs w:val="24"/>
@@ -610,7 +518,7 @@
       </w:r>
       <w:r>
         <w:rPr>
-          <w:rFonts w:ascii="Arial" w:eastAsia="Times New Roman" w:hAnsi="Arial" w:cs="Arial"/>
+          <w:rFonts w:ascii="Arial" w:hAnsi="Arial" w:eastAsia="Times New Roman" w:cs="Arial"/>
           <w:color w:val="000000"/>
           <w:sz w:val="24"/>
           <w:szCs w:val="24"/>
@@ -619,7 +527,7 @@
       </w:r>
       <w:r>
         <w:rPr>
-          <w:rFonts w:ascii="Arial" w:eastAsia="Times New Roman" w:hAnsi="Arial" w:cs="Arial"/>
+          <w:rFonts w:ascii="Arial" w:hAnsi="Arial" w:eastAsia="Times New Roman" w:cs="Arial"/>
           <w:color w:val="000000"/>
           <w:sz w:val="24"/>
           <w:szCs w:val="24"/>
@@ -633,7 +541,7 @@
         <w:spacing w:after="0" w:line="240" w:lineRule="auto"/>
         <w:jc w:val="both"/>
         <w:rPr>
-          <w:rFonts w:ascii="Arial" w:eastAsia="Times New Roman" w:hAnsi="Arial" w:cs="Arial"/>
+          <w:rFonts w:ascii="Arial" w:hAnsi="Arial" w:eastAsia="Times New Roman" w:cs="Arial"/>
           <w:color w:val="000000"/>
           <w:sz w:val="24"/>
           <w:szCs w:val="24"/>
@@ -648,17 +556,18 @@
           <w:numId w:val="20"/>
         </w:numPr>
         <w:spacing w:after="0" w:line="240" w:lineRule="auto"/>
+        <w:ind w:left="720" w:hanging="360"/>
         <w:jc w:val="both"/>
         <w:rPr>
-          <w:rFonts w:ascii="Arial" w:eastAsia="Times New Roman" w:hAnsi="Arial" w:cs="Arial"/>
-          <w:color w:val="000000"/>
-          <w:sz w:val="24"/>
-          <w:szCs w:val="24"/>
-        </w:rPr>
-      </w:pPr>
-      <w:r>
-        <w:rPr>
-          <w:rFonts w:ascii="Arial" w:eastAsia="Times New Roman" w:hAnsi="Arial" w:cs="Arial"/>
+          <w:rFonts w:ascii="Arial" w:hAnsi="Arial" w:eastAsia="Times New Roman" w:cs="Arial"/>
+          <w:color w:val="000000"/>
+          <w:sz w:val="24"/>
+          <w:szCs w:val="24"/>
+        </w:rPr>
+      </w:pPr>
+      <w:r>
+        <w:rPr>
+          <w:rFonts w:ascii="Arial" w:hAnsi="Arial" w:eastAsia="Times New Roman" w:cs="Arial"/>
           <w:color w:val="000000"/>
           <w:sz w:val="24"/>
           <w:szCs w:val="24"/>
@@ -667,7 +576,7 @@
       </w:r>
       <w:r>
         <w:rPr>
-          <w:rFonts w:ascii="Arial" w:eastAsia="Times New Roman" w:hAnsi="Arial" w:cs="Arial"/>
+          <w:rFonts w:ascii="Arial" w:hAnsi="Arial" w:eastAsia="Times New Roman" w:cs="Arial"/>
           <w:color w:val="000000"/>
           <w:sz w:val="24"/>
           <w:szCs w:val="24"/>
@@ -676,7 +585,7 @@
       </w:r>
       <w:r>
         <w:rPr>
-          <w:rFonts w:ascii="Arial" w:eastAsia="Times New Roman" w:hAnsi="Arial" w:cs="Arial"/>
+          <w:rFonts w:ascii="Arial" w:hAnsi="Arial" w:eastAsia="Times New Roman" w:cs="Arial"/>
           <w:color w:val="000000"/>
           <w:sz w:val="24"/>
           <w:szCs w:val="24"/>
@@ -685,7 +594,7 @@
       </w:r>
       <w:r>
         <w:rPr>
-          <w:rFonts w:ascii="Arial" w:eastAsia="Times New Roman" w:hAnsi="Arial" w:cs="Arial"/>
+          <w:rFonts w:ascii="Arial" w:hAnsi="Arial" w:eastAsia="Times New Roman" w:cs="Arial"/>
           <w:color w:val="000000"/>
           <w:sz w:val="24"/>
           <w:szCs w:val="24"/>
@@ -694,7 +603,7 @@
       </w:r>
       <w:r>
         <w:rPr>
-          <w:rFonts w:ascii="Arial" w:eastAsia="Times New Roman" w:hAnsi="Arial" w:cs="Arial"/>
+          <w:rFonts w:ascii="Arial" w:hAnsi="Arial" w:eastAsia="Times New Roman" w:cs="Arial"/>
           <w:color w:val="000000"/>
           <w:sz w:val="24"/>
           <w:szCs w:val="24"/>
@@ -703,7 +612,7 @@
       </w:r>
       <w:r>
         <w:rPr>
-          <w:rFonts w:ascii="Arial" w:eastAsia="Times New Roman" w:hAnsi="Arial" w:cs="Arial"/>
+          <w:rFonts w:ascii="Arial" w:hAnsi="Arial" w:eastAsia="Times New Roman" w:cs="Arial"/>
           <w:color w:val="000000"/>
           <w:sz w:val="24"/>
           <w:szCs w:val="24"/>
@@ -712,7 +621,7 @@
       </w:r>
       <w:r>
         <w:rPr>
-          <w:rFonts w:ascii="Arial" w:eastAsia="Times New Roman" w:hAnsi="Arial" w:cs="Arial"/>
+          <w:rFonts w:ascii="Arial" w:hAnsi="Arial" w:eastAsia="Times New Roman" w:cs="Arial"/>
           <w:color w:val="000000"/>
           <w:sz w:val="24"/>
           <w:szCs w:val="24"/>
@@ -724,7 +633,7 @@
       <w:pPr>
         <w:pStyle w:val="Prrafodelista"/>
         <w:rPr>
-          <w:rFonts w:ascii="Arial" w:eastAsia="Times New Roman" w:hAnsi="Arial" w:cs="Arial"/>
+          <w:rFonts w:ascii="Arial" w:hAnsi="Arial" w:eastAsia="Times New Roman" w:cs="Arial"/>
           <w:color w:val="000000"/>
           <w:sz w:val="24"/>
           <w:szCs w:val="24"/>
@@ -739,17 +648,18 @@
           <w:numId w:val="20"/>
         </w:numPr>
         <w:spacing w:after="0" w:line="240" w:lineRule="auto"/>
+        <w:ind w:left="720" w:hanging="360"/>
         <w:jc w:val="both"/>
         <w:rPr>
-          <w:rFonts w:ascii="Arial" w:eastAsia="Times New Roman" w:hAnsi="Arial" w:cs="Arial"/>
-          <w:color w:val="000000"/>
-          <w:sz w:val="24"/>
-          <w:szCs w:val="24"/>
-        </w:rPr>
-      </w:pPr>
-      <w:r>
-        <w:rPr>
-          <w:rFonts w:ascii="Arial" w:eastAsia="Times New Roman" w:hAnsi="Arial" w:cs="Arial"/>
+          <w:rFonts w:ascii="Arial" w:hAnsi="Arial" w:eastAsia="Times New Roman" w:cs="Arial"/>
+          <w:color w:val="000000"/>
+          <w:sz w:val="24"/>
+          <w:szCs w:val="24"/>
+        </w:rPr>
+      </w:pPr>
+      <w:r>
+        <w:rPr>
+          <w:rFonts w:ascii="Arial" w:hAnsi="Arial" w:eastAsia="Times New Roman" w:cs="Arial"/>
           <w:color w:val="000000"/>
           <w:sz w:val="24"/>
           <w:szCs w:val="24"/>
@@ -758,7 +668,7 @@
       </w:r>
       <w:r>
         <w:rPr>
-          <w:rFonts w:ascii="Arial" w:eastAsia="Times New Roman" w:hAnsi="Arial" w:cs="Arial"/>
+          <w:rFonts w:ascii="Arial" w:hAnsi="Arial" w:eastAsia="Times New Roman" w:cs="Arial"/>
           <w:color w:val="000000"/>
           <w:sz w:val="24"/>
           <w:szCs w:val="24"/>
@@ -767,7 +677,7 @@
       </w:r>
       <w:r>
         <w:rPr>
-          <w:rFonts w:ascii="Arial" w:eastAsia="Times New Roman" w:hAnsi="Arial" w:cs="Arial"/>
+          <w:rFonts w:ascii="Arial" w:hAnsi="Arial" w:eastAsia="Times New Roman" w:cs="Arial"/>
           <w:color w:val="000000"/>
           <w:sz w:val="24"/>
           <w:szCs w:val="24"/>
@@ -776,7 +686,7 @@
       </w:r>
       <w:r>
         <w:rPr>
-          <w:rFonts w:ascii="Arial" w:eastAsia="Times New Roman" w:hAnsi="Arial" w:cs="Arial"/>
+          <w:rFonts w:ascii="Arial" w:hAnsi="Arial" w:eastAsia="Times New Roman" w:cs="Arial"/>
           <w:color w:val="000000"/>
           <w:sz w:val="24"/>
           <w:szCs w:val="24"/>
@@ -785,7 +695,7 @@
       </w:r>
       <w:r>
         <w:rPr>
-          <w:rFonts w:ascii="Arial" w:eastAsia="Times New Roman" w:hAnsi="Arial" w:cs="Arial"/>
+          <w:rFonts w:ascii="Arial" w:hAnsi="Arial" w:eastAsia="Times New Roman" w:cs="Arial"/>
           <w:color w:val="000000"/>
           <w:sz w:val="24"/>
           <w:szCs w:val="24"/>
@@ -794,7 +704,7 @@
       </w:r>
       <w:r>
         <w:rPr>
-          <w:rFonts w:ascii="Arial" w:eastAsia="Times New Roman" w:hAnsi="Arial" w:cs="Arial"/>
+          <w:rFonts w:ascii="Arial" w:hAnsi="Arial" w:eastAsia="Times New Roman" w:cs="Arial"/>
           <w:color w:val="000000"/>
           <w:sz w:val="24"/>
           <w:szCs w:val="24"/>
@@ -803,7 +713,7 @@
       </w:r>
       <w:r>
         <w:rPr>
-          <w:rFonts w:ascii="Arial" w:eastAsia="Times New Roman" w:hAnsi="Arial" w:cs="Arial"/>
+          <w:rFonts w:ascii="Arial" w:hAnsi="Arial" w:eastAsia="Times New Roman" w:cs="Arial"/>
           <w:color w:val="000000"/>
           <w:sz w:val="24"/>
           <w:szCs w:val="24"/>
@@ -812,7 +722,7 @@
       </w:r>
       <w:r>
         <w:rPr>
-          <w:rFonts w:ascii="Arial" w:eastAsia="Times New Roman" w:hAnsi="Arial" w:cs="Arial"/>
+          <w:rFonts w:ascii="Arial" w:hAnsi="Arial" w:eastAsia="Times New Roman" w:cs="Arial"/>
           <w:color w:val="000000"/>
           <w:sz w:val="24"/>
           <w:szCs w:val="24"/>
@@ -821,7 +731,7 @@
       </w:r>
       <w:r>
         <w:rPr>
-          <w:rFonts w:ascii="Arial" w:eastAsia="Times New Roman" w:hAnsi="Arial" w:cs="Arial"/>
+          <w:rFonts w:ascii="Arial" w:hAnsi="Arial" w:eastAsia="Times New Roman" w:cs="Arial"/>
           <w:color w:val="000000"/>
           <w:sz w:val="24"/>
           <w:szCs w:val="24"/>
@@ -830,7 +740,7 @@
       </w:r>
       <w:r>
         <w:rPr>
-          <w:rFonts w:ascii="Arial" w:eastAsia="Times New Roman" w:hAnsi="Arial" w:cs="Arial"/>
+          <w:rFonts w:ascii="Arial" w:hAnsi="Arial" w:eastAsia="Times New Roman" w:cs="Arial"/>
           <w:color w:val="000000"/>
           <w:sz w:val="24"/>
           <w:szCs w:val="24"/>
@@ -839,7 +749,7 @@
       </w:r>
       <w:r>
         <w:rPr>
-          <w:rFonts w:ascii="Arial" w:eastAsia="Times New Roman" w:hAnsi="Arial" w:cs="Arial"/>
+          <w:rFonts w:ascii="Arial" w:hAnsi="Arial" w:eastAsia="Times New Roman" w:cs="Arial"/>
           <w:color w:val="000000"/>
           <w:sz w:val="24"/>
           <w:szCs w:val="24"/>
@@ -851,7 +761,7 @@
       <w:pPr>
         <w:pStyle w:val="Prrafodelista"/>
         <w:rPr>
-          <w:rFonts w:ascii="Arial" w:eastAsia="Times New Roman" w:hAnsi="Arial" w:cs="Arial"/>
+          <w:rFonts w:ascii="Arial" w:hAnsi="Arial" w:eastAsia="Times New Roman" w:cs="Arial"/>
           <w:color w:val="000000"/>
           <w:sz w:val="24"/>
           <w:szCs w:val="24"/>
@@ -866,17 +776,18 @@
           <w:numId w:val="20"/>
         </w:numPr>
         <w:spacing w:after="0" w:line="240" w:lineRule="auto"/>
+        <w:ind w:left="720" w:hanging="360"/>
         <w:jc w:val="both"/>
         <w:rPr>
-          <w:rFonts w:ascii="Arial" w:eastAsia="Times New Roman" w:hAnsi="Arial" w:cs="Arial"/>
-          <w:color w:val="000000"/>
-          <w:sz w:val="24"/>
-          <w:szCs w:val="24"/>
-        </w:rPr>
-      </w:pPr>
-      <w:r>
-        <w:rPr>
-          <w:rFonts w:ascii="Arial" w:eastAsia="Times New Roman" w:hAnsi="Arial" w:cs="Arial"/>
+          <w:rFonts w:ascii="Arial" w:hAnsi="Arial" w:eastAsia="Times New Roman" w:cs="Arial"/>
+          <w:color w:val="000000"/>
+          <w:sz w:val="24"/>
+          <w:szCs w:val="24"/>
+        </w:rPr>
+      </w:pPr>
+      <w:r>
+        <w:rPr>
+          <w:rFonts w:ascii="Arial" w:hAnsi="Arial" w:eastAsia="Times New Roman" w:cs="Arial"/>
           <w:color w:val="000000"/>
           <w:sz w:val="24"/>
           <w:szCs w:val="24"/>
@@ -885,7 +796,7 @@
       </w:r>
       <w:r>
         <w:rPr>
-          <w:rFonts w:ascii="Arial" w:eastAsia="Times New Roman" w:hAnsi="Arial" w:cs="Arial"/>
+          <w:rFonts w:ascii="Arial" w:hAnsi="Arial" w:eastAsia="Times New Roman" w:cs="Arial"/>
           <w:color w:val="000000"/>
           <w:sz w:val="24"/>
           <w:szCs w:val="24"/>
@@ -894,7 +805,7 @@
       </w:r>
       <w:r>
         <w:rPr>
-          <w:rFonts w:ascii="Arial" w:eastAsia="Times New Roman" w:hAnsi="Arial" w:cs="Arial"/>
+          <w:rFonts w:ascii="Arial" w:hAnsi="Arial" w:eastAsia="Times New Roman" w:cs="Arial"/>
           <w:color w:val="000000"/>
           <w:sz w:val="24"/>
           <w:szCs w:val="24"/>
@@ -903,7 +814,7 @@
       </w:r>
       <w:r>
         <w:rPr>
-          <w:rFonts w:ascii="Arial" w:eastAsia="Times New Roman" w:hAnsi="Arial" w:cs="Arial"/>
+          <w:rFonts w:ascii="Arial" w:hAnsi="Arial" w:eastAsia="Times New Roman" w:cs="Arial"/>
           <w:color w:val="000000"/>
           <w:sz w:val="24"/>
           <w:szCs w:val="24"/>
@@ -912,7 +823,7 @@
       </w:r>
       <w:r>
         <w:rPr>
-          <w:rFonts w:ascii="Arial" w:eastAsia="Times New Roman" w:hAnsi="Arial" w:cs="Arial"/>
+          <w:rFonts w:ascii="Arial" w:hAnsi="Arial" w:eastAsia="Times New Roman" w:cs="Arial"/>
           <w:color w:val="000000"/>
           <w:sz w:val="24"/>
           <w:szCs w:val="24"/>
@@ -921,7 +832,7 @@
       </w:r>
       <w:r>
         <w:rPr>
-          <w:rFonts w:ascii="Arial" w:eastAsia="Times New Roman" w:hAnsi="Arial" w:cs="Arial"/>
+          <w:rFonts w:ascii="Arial" w:hAnsi="Arial" w:eastAsia="Times New Roman" w:cs="Arial"/>
           <w:color w:val="000000"/>
           <w:sz w:val="24"/>
           <w:szCs w:val="24"/>
@@ -930,7 +841,7 @@
       </w:r>
       <w:r>
         <w:rPr>
-          <w:rFonts w:ascii="Arial" w:eastAsia="Times New Roman" w:hAnsi="Arial" w:cs="Arial"/>
+          <w:rFonts w:ascii="Arial" w:hAnsi="Arial" w:eastAsia="Times New Roman" w:cs="Arial"/>
           <w:color w:val="000000"/>
           <w:sz w:val="24"/>
           <w:szCs w:val="24"/>
@@ -939,7 +850,7 @@
       </w:r>
       <w:r>
         <w:rPr>
-          <w:rFonts w:ascii="Arial" w:eastAsia="Times New Roman" w:hAnsi="Arial" w:cs="Arial"/>
+          <w:rFonts w:ascii="Arial" w:hAnsi="Arial" w:eastAsia="Times New Roman" w:cs="Arial"/>
           <w:color w:val="000000"/>
           <w:sz w:val="24"/>
           <w:szCs w:val="24"/>
@@ -948,7 +859,7 @@
       </w:r>
       <w:r>
         <w:rPr>
-          <w:rFonts w:ascii="Arial" w:eastAsia="Times New Roman" w:hAnsi="Arial" w:cs="Arial"/>
+          <w:rFonts w:ascii="Arial" w:hAnsi="Arial" w:eastAsia="Times New Roman" w:cs="Arial"/>
           <w:color w:val="000000"/>
           <w:sz w:val="24"/>
           <w:szCs w:val="24"/>
@@ -957,7 +868,7 @@
       </w:r>
       <w:r>
         <w:rPr>
-          <w:rFonts w:ascii="Arial" w:eastAsia="Times New Roman" w:hAnsi="Arial" w:cs="Arial"/>
+          <w:rFonts w:ascii="Arial" w:hAnsi="Arial" w:eastAsia="Times New Roman" w:cs="Arial"/>
           <w:color w:val="000000"/>
           <w:sz w:val="24"/>
           <w:szCs w:val="24"/>
@@ -966,7 +877,7 @@
       </w:r>
       <w:r>
         <w:rPr>
-          <w:rFonts w:ascii="Arial" w:eastAsia="Times New Roman" w:hAnsi="Arial" w:cs="Arial"/>
+          <w:rFonts w:ascii="Arial" w:hAnsi="Arial" w:eastAsia="Times New Roman" w:cs="Arial"/>
           <w:color w:val="000000"/>
           <w:sz w:val="24"/>
           <w:szCs w:val="24"/>
@@ -980,7 +891,7 @@
         <w:ind w:left="720"/>
         <w:jc w:val="both"/>
         <w:rPr>
-          <w:rFonts w:ascii="Arial" w:eastAsia="Times New Roman" w:hAnsi="Arial" w:cs="Arial"/>
+          <w:rFonts w:ascii="Arial" w:hAnsi="Arial" w:eastAsia="Times New Roman" w:cs="Arial"/>
           <w:color w:val="000000"/>
           <w:sz w:val="24"/>
           <w:szCs w:val="24"/>
@@ -995,17 +906,18 @@
           <w:numId w:val="19"/>
         </w:numPr>
         <w:spacing w:after="0" w:line="240" w:lineRule="auto"/>
+        <w:ind w:left="720" w:hanging="360"/>
         <w:jc w:val="both"/>
         <w:rPr>
-          <w:rFonts w:ascii="Arial" w:eastAsia="Times New Roman" w:hAnsi="Arial" w:cs="Arial"/>
-          <w:color w:val="000000"/>
-          <w:sz w:val="24"/>
-          <w:szCs w:val="24"/>
-        </w:rPr>
-      </w:pPr>
-      <w:r>
-        <w:rPr>
-          <w:rFonts w:ascii="Arial" w:eastAsia="Times New Roman" w:hAnsi="Arial" w:cs="Arial"/>
+          <w:rFonts w:ascii="Arial" w:hAnsi="Arial" w:eastAsia="Times New Roman" w:cs="Arial"/>
+          <w:color w:val="000000"/>
+          <w:sz w:val="24"/>
+          <w:szCs w:val="24"/>
+        </w:rPr>
+      </w:pPr>
+      <w:r>
+        <w:rPr>
+          <w:rFonts w:ascii="Arial" w:hAnsi="Arial" w:eastAsia="Times New Roman" w:cs="Arial"/>
           <w:color w:val="000000"/>
           <w:sz w:val="24"/>
           <w:szCs w:val="24"/>
@@ -1014,7 +926,7 @@
       </w:r>
       <w:r>
         <w:rPr>
-          <w:rFonts w:ascii="Arial" w:eastAsia="Times New Roman" w:hAnsi="Arial" w:cs="Arial"/>
+          <w:rFonts w:ascii="Arial" w:hAnsi="Arial" w:eastAsia="Times New Roman" w:cs="Arial"/>
           <w:color w:val="000000"/>
           <w:sz w:val="24"/>
           <w:szCs w:val="24"/>
@@ -1023,7 +935,7 @@
       </w:r>
       <w:r>
         <w:rPr>
-          <w:rFonts w:ascii="Arial" w:eastAsia="Times New Roman" w:hAnsi="Arial" w:cs="Arial"/>
+          <w:rFonts w:ascii="Arial" w:hAnsi="Arial" w:eastAsia="Times New Roman" w:cs="Arial"/>
           <w:color w:val="000000"/>
           <w:sz w:val="24"/>
           <w:szCs w:val="24"/>
@@ -1032,7 +944,7 @@
       </w:r>
       <w:r>
         <w:rPr>
-          <w:rFonts w:ascii="Arial" w:eastAsia="Times New Roman" w:hAnsi="Arial" w:cs="Arial"/>
+          <w:rFonts w:ascii="Arial" w:hAnsi="Arial" w:eastAsia="Times New Roman" w:cs="Arial"/>
           <w:color w:val="000000"/>
           <w:sz w:val="24"/>
           <w:szCs w:val="24"/>
@@ -1041,7 +953,7 @@
       </w:r>
       <w:r>
         <w:rPr>
-          <w:rFonts w:ascii="Arial" w:eastAsia="Times New Roman" w:hAnsi="Arial" w:cs="Arial"/>
+          <w:rFonts w:ascii="Arial" w:hAnsi="Arial" w:eastAsia="Times New Roman" w:cs="Arial"/>
           <w:color w:val="000000"/>
           <w:sz w:val="24"/>
           <w:szCs w:val="24"/>
@@ -1054,7 +966,7 @@
         <w:spacing w:after="0" w:line="240" w:lineRule="auto"/>
         <w:jc w:val="both"/>
         <w:rPr>
-          <w:rFonts w:ascii="Arial" w:eastAsia="Times New Roman" w:hAnsi="Arial" w:cs="Arial"/>
+          <w:rFonts w:ascii="Arial" w:hAnsi="Arial" w:eastAsia="Times New Roman" w:cs="Arial"/>
           <w:color w:val="000000"/>
           <w:sz w:val="24"/>
           <w:szCs w:val="24"/>
@@ -1067,15 +979,15 @@
         <w:ind w:firstLine="360"/>
         <w:jc w:val="both"/>
         <w:rPr>
-          <w:rFonts w:ascii="Arial" w:eastAsia="Times New Roman" w:hAnsi="Arial" w:cs="Arial"/>
-          <w:color w:val="000000"/>
-          <w:sz w:val="24"/>
-          <w:szCs w:val="24"/>
-        </w:rPr>
-      </w:pPr>
-      <w:r>
-        <w:rPr>
-          <w:rFonts w:ascii="Arial" w:eastAsia="Times New Roman" w:hAnsi="Arial" w:cs="Arial"/>
+          <w:rFonts w:ascii="Arial" w:hAnsi="Arial" w:eastAsia="Times New Roman" w:cs="Arial"/>
+          <w:color w:val="000000"/>
+          <w:sz w:val="24"/>
+          <w:szCs w:val="24"/>
+        </w:rPr>
+      </w:pPr>
+      <w:r>
+        <w:rPr>
+          <w:rFonts w:ascii="Arial" w:hAnsi="Arial" w:eastAsia="Times New Roman" w:cs="Arial"/>
           <w:color w:val="000000"/>
           <w:sz w:val="24"/>
           <w:szCs w:val="24"/>
@@ -1084,7 +996,7 @@
       </w:r>
       <w:r>
         <w:rPr>
-          <w:rFonts w:ascii="Arial" w:eastAsia="Times New Roman" w:hAnsi="Arial" w:cs="Arial"/>
+          <w:rFonts w:ascii="Arial" w:hAnsi="Arial" w:eastAsia="Times New Roman" w:cs="Arial"/>
           <w:color w:val="000000"/>
           <w:sz w:val="24"/>
           <w:szCs w:val="24"/>
@@ -1093,7 +1005,7 @@
       </w:r>
       <w:r>
         <w:rPr>
-          <w:rFonts w:ascii="Arial" w:eastAsia="Times New Roman" w:hAnsi="Arial" w:cs="Arial"/>
+          <w:rFonts w:ascii="Arial" w:hAnsi="Arial" w:eastAsia="Times New Roman" w:cs="Arial"/>
           <w:color w:val="000000"/>
           <w:sz w:val="24"/>
           <w:szCs w:val="24"/>
@@ -1102,17 +1014,16 @@
       </w:r>
       <w:r>
         <w:rPr>
-          <w:rFonts w:ascii="Arial" w:eastAsia="Times New Roman" w:hAnsi="Arial" w:cs="Arial"/>
-          <w:color w:val="000000"/>
-          <w:sz w:val="24"/>
-          <w:szCs w:val="24"/>
-        </w:rPr>
-        <w:lastRenderedPageBreak/>
+          <w:rFonts w:ascii="Arial" w:hAnsi="Arial" w:eastAsia="Times New Roman" w:cs="Arial"/>
+          <w:color w:val="000000"/>
+          <w:sz w:val="24"/>
+          <w:szCs w:val="24"/>
+        </w:rPr>
         <w:t xml:space="preserve">de seguridad y salud en </w:t>
       </w:r>
       <w:r>
         <w:rPr>
-          <w:rFonts w:ascii="Arial" w:eastAsia="Times New Roman" w:hAnsi="Arial" w:cs="Arial"/>
+          <w:rFonts w:ascii="Arial" w:hAnsi="Arial" w:eastAsia="Times New Roman" w:cs="Arial"/>
           <w:color w:val="000000"/>
           <w:sz w:val="24"/>
           <w:szCs w:val="24"/>
@@ -1121,7 +1032,7 @@
       </w:r>
       <w:r>
         <w:rPr>
-          <w:rFonts w:ascii="Arial" w:eastAsia="Times New Roman" w:hAnsi="Arial" w:cs="Arial"/>
+          <w:rFonts w:ascii="Arial" w:hAnsi="Arial" w:eastAsia="Times New Roman" w:cs="Arial"/>
           <w:color w:val="000000"/>
           <w:sz w:val="24"/>
           <w:szCs w:val="24"/>
@@ -1130,7 +1041,7 @@
       </w:r>
       <w:r>
         <w:rPr>
-          <w:rFonts w:ascii="Arial" w:eastAsia="Times New Roman" w:hAnsi="Arial" w:cs="Arial"/>
+          <w:rFonts w:ascii="Arial" w:hAnsi="Arial" w:eastAsia="Times New Roman" w:cs="Arial"/>
           <w:color w:val="000000"/>
           <w:sz w:val="24"/>
           <w:szCs w:val="24"/>
@@ -1139,7 +1050,7 @@
       </w:r>
       <w:r>
         <w:rPr>
-          <w:rFonts w:ascii="Arial" w:eastAsia="Times New Roman" w:hAnsi="Arial" w:cs="Arial"/>
+          <w:rFonts w:ascii="Arial" w:hAnsi="Arial" w:eastAsia="Times New Roman" w:cs="Arial"/>
           <w:color w:val="000000"/>
           <w:sz w:val="24"/>
           <w:szCs w:val="24"/>
@@ -1148,7 +1059,7 @@
       </w:r>
       <w:r>
         <w:rPr>
-          <w:rFonts w:ascii="Arial" w:eastAsia="Times New Roman" w:hAnsi="Arial" w:cs="Arial"/>
+          <w:rFonts w:ascii="Arial" w:hAnsi="Arial" w:eastAsia="Times New Roman" w:cs="Arial"/>
           <w:color w:val="000000"/>
           <w:sz w:val="24"/>
           <w:szCs w:val="24"/>
@@ -1157,7 +1068,7 @@
       </w:r>
       <w:r>
         <w:rPr>
-          <w:rFonts w:ascii="Arial" w:eastAsia="Times New Roman" w:hAnsi="Arial" w:cs="Arial"/>
+          <w:rFonts w:ascii="Arial" w:hAnsi="Arial" w:eastAsia="Times New Roman" w:cs="Arial"/>
           <w:color w:val="000000"/>
           <w:sz w:val="24"/>
           <w:szCs w:val="24"/>
@@ -1166,7 +1077,7 @@
       </w:r>
       <w:r>
         <w:rPr>
-          <w:rFonts w:ascii="Arial" w:eastAsia="Times New Roman" w:hAnsi="Arial" w:cs="Arial"/>
+          <w:rFonts w:ascii="Arial" w:hAnsi="Arial" w:eastAsia="Times New Roman" w:cs="Arial"/>
           <w:color w:val="000000"/>
           <w:sz w:val="24"/>
           <w:szCs w:val="24"/>
@@ -1175,7 +1086,7 @@
       </w:r>
       <w:r>
         <w:rPr>
-          <w:rFonts w:ascii="Arial" w:eastAsia="Times New Roman" w:hAnsi="Arial" w:cs="Arial"/>
+          <w:rFonts w:ascii="Arial" w:hAnsi="Arial" w:eastAsia="Times New Roman" w:cs="Arial"/>
           <w:color w:val="000000"/>
           <w:sz w:val="24"/>
           <w:szCs w:val="24"/>
@@ -1184,7 +1095,7 @@
       </w:r>
       <w:r>
         <w:rPr>
-          <w:rFonts w:ascii="Arial" w:eastAsia="Times New Roman" w:hAnsi="Arial" w:cs="Arial"/>
+          <w:rFonts w:ascii="Arial" w:hAnsi="Arial" w:eastAsia="Times New Roman" w:cs="Arial"/>
           <w:color w:val="000000"/>
           <w:sz w:val="24"/>
           <w:szCs w:val="24"/>
@@ -1198,7 +1109,7 @@
         <w:ind w:firstLine="360"/>
         <w:jc w:val="both"/>
         <w:rPr>
-          <w:rFonts w:ascii="Arial" w:eastAsia="Times New Roman" w:hAnsi="Arial" w:cs="Arial"/>
+          <w:rFonts w:ascii="Arial" w:hAnsi="Arial" w:eastAsia="Times New Roman" w:cs="Arial"/>
           <w:color w:val="000000"/>
           <w:sz w:val="24"/>
           <w:szCs w:val="24"/>
@@ -1211,15 +1122,15 @@
         <w:ind w:firstLine="360"/>
         <w:jc w:val="both"/>
         <w:rPr>
-          <w:rFonts w:ascii="Arial" w:eastAsia="Times New Roman" w:hAnsi="Arial" w:cs="Arial"/>
-          <w:color w:val="000000"/>
-          <w:sz w:val="24"/>
-          <w:szCs w:val="24"/>
-        </w:rPr>
-      </w:pPr>
-      <w:r>
-        <w:rPr>
-          <w:rFonts w:ascii="Arial" w:eastAsia="Times New Roman" w:hAnsi="Arial" w:cs="Arial"/>
+          <w:rFonts w:ascii="Arial" w:hAnsi="Arial" w:eastAsia="Times New Roman" w:cs="Arial"/>
+          <w:color w:val="000000"/>
+          <w:sz w:val="24"/>
+          <w:szCs w:val="24"/>
+        </w:rPr>
+      </w:pPr>
+      <w:r>
+        <w:rPr>
+          <w:rFonts w:ascii="Arial" w:hAnsi="Arial" w:eastAsia="Times New Roman" w:cs="Arial"/>
           <w:color w:val="000000"/>
           <w:sz w:val="24"/>
           <w:szCs w:val="24"/>
@@ -1232,7 +1143,7 @@
         <w:spacing w:after="0" w:line="240" w:lineRule="auto"/>
         <w:jc w:val="both"/>
         <w:rPr>
-          <w:rFonts w:ascii="Arial" w:eastAsia="Times New Roman" w:hAnsi="Arial" w:cs="Arial"/>
+          <w:rFonts w:ascii="Arial" w:hAnsi="Arial" w:eastAsia="Times New Roman" w:cs="Arial"/>
           <w:color w:val="000000"/>
           <w:sz w:val="24"/>
           <w:szCs w:val="24"/>
@@ -1244,15 +1155,15 @@
         <w:spacing w:after="0" w:line="240" w:lineRule="auto"/>
         <w:jc w:val="both"/>
         <w:rPr>
-          <w:rFonts w:ascii="Arial" w:eastAsia="Times New Roman" w:hAnsi="Arial" w:cs="Arial"/>
-          <w:color w:val="000000"/>
-          <w:sz w:val="24"/>
-          <w:szCs w:val="24"/>
-        </w:rPr>
-      </w:pPr>
-      <w:r>
-        <w:rPr>
-          <w:rFonts w:ascii="Arial" w:eastAsia="Times New Roman" w:hAnsi="Arial" w:cs="Arial"/>
+          <w:rFonts w:ascii="Arial" w:hAnsi="Arial" w:eastAsia="Times New Roman" w:cs="Arial"/>
+          <w:color w:val="000000"/>
+          <w:sz w:val="24"/>
+          <w:szCs w:val="24"/>
+        </w:rPr>
+      </w:pPr>
+      <w:r>
+        <w:rPr>
+          <w:rFonts w:ascii="Arial" w:hAnsi="Arial" w:eastAsia="Times New Roman" w:cs="Arial"/>
           <w:color w:val="000000" w:themeColor="text1"/>
           <w:sz w:val="24"/>
           <w:szCs w:val="24"/>
@@ -1261,7 +1172,7 @@
       </w:r>
       <w:r>
         <w:rPr>
-          <w:rFonts w:ascii="Arial" w:eastAsia="Times New Roman" w:hAnsi="Arial" w:cs="Arial"/>
+          <w:rFonts w:ascii="Arial" w:hAnsi="Arial" w:eastAsia="Times New Roman" w:cs="Arial"/>
           <w:color w:val="000000" w:themeColor="text1"/>
           <w:sz w:val="24"/>
           <w:szCs w:val="24"/>
@@ -1270,7 +1181,7 @@
       </w:r>
       <w:r>
         <w:rPr>
-          <w:rFonts w:ascii="Arial" w:eastAsia="Times New Roman" w:hAnsi="Arial" w:cs="Arial"/>
+          <w:rFonts w:ascii="Arial" w:hAnsi="Arial" w:eastAsia="Times New Roman" w:cs="Arial"/>
           <w:color w:val="000000" w:themeColor="text1"/>
           <w:sz w:val="24"/>
           <w:szCs w:val="24"/>
@@ -1279,7 +1190,7 @@
       </w:r>
       <w:r>
         <w:rPr>
-          <w:rFonts w:ascii="Arial" w:eastAsia="Times New Roman" w:hAnsi="Arial" w:cs="Arial"/>
+          <w:rFonts w:ascii="Arial" w:hAnsi="Arial" w:eastAsia="Times New Roman" w:cs="Arial"/>
           <w:b/>
           <w:bCs/>
           <w:color w:val="FF0000"/>
@@ -1290,7 +1201,7 @@
       </w:r>
       <w:r>
         <w:rPr>
-          <w:rFonts w:ascii="Arial" w:eastAsia="Times New Roman" w:hAnsi="Arial" w:cs="Arial"/>
+          <w:rFonts w:ascii="Arial" w:hAnsi="Arial" w:eastAsia="Times New Roman" w:cs="Arial"/>
           <w:b/>
           <w:bCs/>
           <w:color w:val="FF0000"/>
@@ -1301,7 +1212,7 @@
       </w:r>
       <w:r>
         <w:rPr>
-          <w:rFonts w:ascii="Arial" w:eastAsia="Times New Roman" w:hAnsi="Arial" w:cs="Arial"/>
+          <w:rFonts w:ascii="Arial" w:hAnsi="Arial" w:eastAsia="Times New Roman" w:cs="Arial"/>
           <w:b/>
           <w:bCs/>
           <w:color w:val="FF0000"/>
@@ -1312,7 +1223,7 @@
       </w:r>
       <w:r>
         <w:rPr>
-          <w:rFonts w:ascii="Arial" w:eastAsia="Times New Roman" w:hAnsi="Arial" w:cs="Arial"/>
+          <w:rFonts w:ascii="Arial" w:hAnsi="Arial" w:eastAsia="Times New Roman" w:cs="Arial"/>
           <w:b/>
           <w:bCs/>
           <w:color w:val="FF0000"/>
@@ -1323,7 +1234,7 @@
       </w:r>
       <w:r>
         <w:rPr>
-          <w:rFonts w:ascii="Arial" w:eastAsia="Times New Roman" w:hAnsi="Arial" w:cs="Arial"/>
+          <w:rFonts w:ascii="Arial" w:hAnsi="Arial" w:eastAsia="Times New Roman" w:cs="Arial"/>
           <w:b/>
           <w:bCs/>
           <w:color w:val="FF0000"/>
@@ -1334,7 +1245,7 @@
       </w:r>
       <w:r>
         <w:rPr>
-          <w:rFonts w:ascii="Arial" w:eastAsia="Times New Roman" w:hAnsi="Arial" w:cs="Arial"/>
+          <w:rFonts w:ascii="Arial" w:hAnsi="Arial" w:eastAsia="Times New Roman" w:cs="Arial"/>
           <w:b/>
           <w:bCs/>
           <w:color w:val="FF0000"/>
@@ -1345,7 +1256,7 @@
       </w:r>
       <w:r>
         <w:rPr>
-          <w:rFonts w:ascii="Arial" w:eastAsia="Times New Roman" w:hAnsi="Arial" w:cs="Arial"/>
+          <w:rFonts w:ascii="Arial" w:hAnsi="Arial" w:eastAsia="Times New Roman" w:cs="Arial"/>
           <w:b/>
           <w:bCs/>
           <w:color w:val="FF0000"/>
@@ -1356,7 +1267,7 @@
       </w:r>
       <w:r>
         <w:rPr>
-          <w:rFonts w:ascii="Arial" w:eastAsia="Times New Roman" w:hAnsi="Arial" w:cs="Arial"/>
+          <w:rFonts w:ascii="Arial" w:hAnsi="Arial" w:eastAsia="Times New Roman" w:cs="Arial"/>
           <w:b/>
           <w:bCs/>
           <w:color w:val="FF0000"/>
@@ -1367,7 +1278,7 @@
       </w:r>
       <w:r>
         <w:rPr>
-          <w:rFonts w:ascii="Arial" w:eastAsia="Times New Roman" w:hAnsi="Arial" w:cs="Arial"/>
+          <w:rFonts w:ascii="Arial" w:hAnsi="Arial" w:eastAsia="Times New Roman" w:cs="Arial"/>
           <w:b/>
           <w:bCs/>
           <w:color w:val="FF0000"/>
@@ -1378,7 +1289,7 @@
       </w:r>
       <w:r>
         <w:rPr>
-          <w:rFonts w:ascii="Arial" w:eastAsia="Times New Roman" w:hAnsi="Arial" w:cs="Arial"/>
+          <w:rFonts w:ascii="Arial" w:hAnsi="Arial" w:eastAsia="Times New Roman" w:cs="Arial"/>
           <w:b/>
           <w:bCs/>
           <w:color w:val="FF0000"/>
@@ -1389,7 +1300,7 @@
       </w:r>
       <w:r>
         <w:rPr>
-          <w:rFonts w:ascii="Arial" w:eastAsia="Times New Roman" w:hAnsi="Arial" w:cs="Arial"/>
+          <w:rFonts w:ascii="Arial" w:hAnsi="Arial" w:eastAsia="Times New Roman" w:cs="Arial"/>
           <w:b/>
           <w:bCs/>
           <w:color w:val="000000" w:themeColor="text1"/>
@@ -1400,7 +1311,7 @@
       </w:r>
       <w:r>
         <w:rPr>
-          <w:rFonts w:ascii="Arial" w:eastAsia="Times New Roman" w:hAnsi="Arial" w:cs="Arial"/>
+          <w:rFonts w:ascii="Arial" w:hAnsi="Arial" w:eastAsia="Times New Roman" w:cs="Arial"/>
           <w:color w:val="000000" w:themeColor="text1"/>
           <w:sz w:val="24"/>
           <w:szCs w:val="24"/>
@@ -1409,7 +1320,7 @@
       </w:r>
       <w:r>
         <w:rPr>
-          <w:rFonts w:ascii="Arial" w:eastAsia="Times New Roman" w:hAnsi="Arial" w:cs="Arial"/>
+          <w:rFonts w:ascii="Arial" w:hAnsi="Arial" w:eastAsia="Times New Roman" w:cs="Arial"/>
           <w:color w:val="000000" w:themeColor="text1"/>
           <w:sz w:val="24"/>
           <w:szCs w:val="24"/>
@@ -1418,7 +1329,7 @@
       </w:r>
       <w:r>
         <w:rPr>
-          <w:rFonts w:ascii="Arial" w:eastAsia="Times New Roman" w:hAnsi="Arial" w:cs="Arial"/>
+          <w:rFonts w:ascii="Arial" w:hAnsi="Arial" w:eastAsia="Times New Roman" w:cs="Arial"/>
           <w:color w:val="000000" w:themeColor="text1"/>
           <w:sz w:val="24"/>
           <w:szCs w:val="24"/>
@@ -1427,7 +1338,7 @@
       </w:r>
       <w:r>
         <w:rPr>
-          <w:rFonts w:ascii="Arial" w:eastAsia="Times New Roman" w:hAnsi="Arial" w:cs="Arial"/>
+          <w:rFonts w:ascii="Arial" w:hAnsi="Arial" w:eastAsia="Times New Roman" w:cs="Arial"/>
           <w:color w:val="000000" w:themeColor="text1"/>
           <w:sz w:val="24"/>
           <w:szCs w:val="24"/>
@@ -1440,7 +1351,7 @@
         <w:spacing w:after="0" w:line="240" w:lineRule="auto"/>
         <w:jc w:val="both"/>
         <w:rPr>
-          <w:rFonts w:ascii="Arial" w:eastAsia="Times New Roman" w:hAnsi="Arial" w:cs="Arial"/>
+          <w:rFonts w:ascii="Arial" w:hAnsi="Arial" w:eastAsia="Times New Roman" w:cs="Arial"/>
           <w:color w:val="000000"/>
           <w:sz w:val="24"/>
           <w:szCs w:val="24"/>
@@ -1452,15 +1363,15 @@
         <w:spacing w:after="0" w:line="240" w:lineRule="auto"/>
         <w:jc w:val="both"/>
         <w:rPr>
-          <w:rFonts w:ascii="Arial" w:eastAsia="Times New Roman" w:hAnsi="Arial" w:cs="Arial"/>
-          <w:color w:val="000000"/>
-          <w:sz w:val="24"/>
-          <w:szCs w:val="24"/>
-        </w:rPr>
-      </w:pPr>
-      <w:r>
-        <w:rPr>
-          <w:rFonts w:ascii="Arial" w:eastAsia="Times New Roman" w:hAnsi="Arial" w:cs="Arial"/>
+          <w:rFonts w:ascii="Arial" w:hAnsi="Arial" w:eastAsia="Times New Roman" w:cs="Arial"/>
+          <w:color w:val="000000"/>
+          <w:sz w:val="24"/>
+          <w:szCs w:val="24"/>
+        </w:rPr>
+      </w:pPr>
+      <w:r>
+        <w:rPr>
+          <w:rFonts w:ascii="Arial" w:hAnsi="Arial" w:eastAsia="Times New Roman" w:cs="Arial"/>
           <w:color w:val="000000"/>
           <w:sz w:val="24"/>
           <w:szCs w:val="24"/>
@@ -1469,7 +1380,7 @@
       </w:r>
       <w:r>
         <w:rPr>
-          <w:rFonts w:ascii="Arial" w:eastAsia="Times New Roman" w:hAnsi="Arial" w:cs="Arial"/>
+          <w:rFonts w:ascii="Arial" w:hAnsi="Arial" w:eastAsia="Times New Roman" w:cs="Arial"/>
           <w:color w:val="000000"/>
           <w:sz w:val="24"/>
           <w:szCs w:val="24"/>
@@ -1478,7 +1389,7 @@
       </w:r>
       <w:r>
         <w:rPr>
-          <w:rFonts w:ascii="Arial" w:eastAsia="Times New Roman" w:hAnsi="Arial" w:cs="Arial"/>
+          <w:rFonts w:ascii="Arial" w:hAnsi="Arial" w:eastAsia="Times New Roman" w:cs="Arial"/>
           <w:color w:val="000000"/>
           <w:sz w:val="24"/>
           <w:szCs w:val="24"/>
@@ -1491,7 +1402,7 @@
         <w:spacing w:after="0" w:line="240" w:lineRule="auto"/>
         <w:jc w:val="both"/>
         <w:rPr>
-          <w:rFonts w:ascii="Arial" w:eastAsia="Times New Roman" w:hAnsi="Arial" w:cs="Arial"/>
+          <w:rFonts w:ascii="Arial" w:hAnsi="Arial" w:eastAsia="Times New Roman" w:cs="Arial"/>
           <w:color w:val="000000"/>
           <w:sz w:val="24"/>
           <w:szCs w:val="24"/>
@@ -1503,15 +1414,15 @@
         <w:spacing w:after="0" w:line="240" w:lineRule="auto"/>
         <w:jc w:val="both"/>
         <w:rPr>
-          <w:rFonts w:ascii="Arial" w:eastAsia="Times New Roman" w:hAnsi="Arial" w:cs="Arial"/>
-          <w:color w:val="000000"/>
-          <w:sz w:val="24"/>
-          <w:szCs w:val="24"/>
-        </w:rPr>
-      </w:pPr>
-      <w:r>
-        <w:rPr>
-          <w:rFonts w:ascii="Arial" w:eastAsia="Times New Roman" w:hAnsi="Arial" w:cs="Arial"/>
+          <w:rFonts w:ascii="Arial" w:hAnsi="Arial" w:eastAsia="Times New Roman" w:cs="Arial"/>
+          <w:color w:val="000000"/>
+          <w:sz w:val="24"/>
+          <w:szCs w:val="24"/>
+        </w:rPr>
+      </w:pPr>
+      <w:r>
+        <w:rPr>
+          <w:rFonts w:ascii="Arial" w:hAnsi="Arial" w:eastAsia="Times New Roman" w:cs="Arial"/>
           <w:color w:val="000000"/>
           <w:sz w:val="24"/>
           <w:szCs w:val="24"/>
@@ -1525,18 +1436,16 @@
           <w:rFonts w:ascii="Arial" w:hAnsi="Arial" w:cs="Arial"/>
           <w:sz w:val="24"/>
           <w:szCs w:val="24"/>
-          <w:lang w:val="es-ES"/>
         </w:rPr>
       </w:pPr>
     </w:p>
     <w:sectPr>
       <w:headerReference w:type="even" r:id="rId8"/>
       <w:headerReference w:type="default" r:id="rId9"/>
+      <w:headerReference w:type="first" r:id="rId11"/>
       <w:footerReference w:type="default" r:id="rId10"/>
-      <w:headerReference w:type="first" r:id="rId11"/>
-      <w:pgSz w:w="12240" w:h="15840" w:code="1"/>
+      <w:pgSz w:w="12240" w:h="15840"/>
       <w:pgMar w:top="1458" w:right="1701" w:bottom="1417" w:left="1701" w:header="720" w:footer="720" w:gutter="0"/>
-      <w:cols w:space="720"/>
       <w:docGrid w:linePitch="360"/>
     </w:sectPr>
   </w:body>
@@ -1569,7 +1478,7 @@
 </file>
 
 <file path=word/footer1.xml><?xml version="1.0" encoding="utf-8"?>
-<w:ftr xmlns:wpc="http://schemas.microsoft.com/office/word/2010/wordprocessingCanvas" xmlns:cx="http://schemas.microsoft.com/office/drawing/2014/chartex" xmlns:cx1="http://schemas.microsoft.com/office/drawing/2015/9/8/chartex" xmlns:cx2="http://schemas.microsoft.com/office/drawing/2015/10/21/chartex" xmlns:cx3="http://schemas.microsoft.com/office/drawing/2016/5/9/chartex" xmlns:cx4="http://schemas.microsoft.com/office/drawing/2016/5/10/chartex" xmlns:cx5="http://schemas.microsoft.com/office/drawing/2016/5/11/chartex" xmlns:cx6="http://schemas.microsoft.com/office/drawing/2016/5/12/chartex" xmlns:cx7="http://schemas.microsoft.com/office/drawing/2016/5/13/chartex" xmlns:cx8="http://schemas.microsoft.com/office/drawing/2016/5/14/chartex" xmlns:mc="http://schemas.openxmlformats.org/markup-compatibility/2006" xmlns:aink="http://schemas.microsoft.com/office/drawing/2016/ink" xmlns:am3d="http://schemas.microsoft.com/office/drawing/2017/model3d" xmlns:o="urn:schemas-microsoft-com:office:office" xmlns:oel="http://schemas.microsoft.com/office/2019/extlst" xmlns:r="http://schemas.openxmlformats.org/officeDocument/2006/relationships" xmlns:m="http://schemas.openxmlformats.org/officeDocument/2006/math" xmlns:v="urn:schemas-microsoft-com:vml" xmlns:wp14="http://schemas.microsoft.com/office/word/2010/wordprocessingDrawing" xmlns:wp="http://schemas.openxmlformats.org/drawingml/2006/wordprocessingDrawing" xmlns:w10="urn:schemas-microsoft-com:office:word" xmlns:w="http://schemas.openxmlformats.org/wordprocessingml/2006/main" xmlns:w14="http://schemas.microsoft.com/office/word/2010/wordml" xmlns:w15="http://schemas.microsoft.com/office/word/2012/wordml" xmlns:w16cex="http://schemas.microsoft.com/office/word/2018/wordml/cex" xmlns:w16cid="http://schemas.microsoft.com/office/word/2016/wordml/cid" xmlns:w16="http://schemas.microsoft.com/office/word/2018/wordml" xmlns:w16du="http://schemas.microsoft.com/office/word/2023/wordml/word16du" xmlns:w16sdtdh="http://schemas.microsoft.com/office/word/2020/wordml/sdtdatahash" xmlns:w16sdtfl="http://schemas.microsoft.com/office/word/2024/wordml/sdtformatlock" xmlns:w16se="http://schemas.microsoft.com/office/word/2015/wordml/symex" xmlns:wpg="http://schemas.microsoft.com/office/word/2010/wordprocessingGroup" xmlns:wpi="http://schemas.microsoft.com/office/word/2010/wordprocessingInk" xmlns:wne="http://schemas.microsoft.com/office/word/2006/wordml" xmlns:wps="http://schemas.microsoft.com/office/word/2010/wordprocessingShape" mc:Ignorable="w14 w15 w16se w16cid w16 w16cex w16sdtdh w16sdtfl w16du wp14">
+<w:ftr xmlns:wpc="http://schemas.microsoft.com/office/word/2010/wordprocessingCanvas" xmlns:mc="http://schemas.openxmlformats.org/markup-compatibility/2006" xmlns:o="urn:schemas-microsoft-com:office:office" xmlns:r="http://schemas.openxmlformats.org/officeDocument/2006/relationships" xmlns:m="http://schemas.openxmlformats.org/officeDocument/2006/math" xmlns:v="urn:schemas-microsoft-com:vml" xmlns:wp14="http://schemas.microsoft.com/office/word/2010/wordprocessingDrawing" xmlns:wp="http://schemas.openxmlformats.org/drawingml/2006/wordprocessingDrawing" xmlns:w10="urn:schemas-microsoft-com:office:word" xmlns:w="http://schemas.openxmlformats.org/wordprocessingml/2006/main" xmlns:w14="http://schemas.microsoft.com/office/word/2010/wordml" xmlns:w15="http://schemas.microsoft.com/office/word/2012/wordml" xmlns:w16se="http://schemas.microsoft.com/office/word/2015/wordml/symex" xmlns:w16cid="http://schemas.microsoft.com/office/word/2016/wordml/cid" xmlns:w16="http://schemas.microsoft.com/office/word/2018/wordml" xmlns:w16cex="http://schemas.microsoft.com/office/word/2018/wordml/cex" xmlns:w16sdtdh="http://schemas.microsoft.com/office/word/2020/wordml/sdtdatahash" xmlns:wne="http://schemas.microsoft.com/office/word/2006/wordml" xmlns:wpg="http://schemas.microsoft.com/office/word/2010/wordprocessingGroup" xmlns:wps="http://schemas.microsoft.com/office/word/2010/wordprocessingShape">
   <w:p>
     <w:pPr>
       <w:pStyle w:val="Piedepgina"/>
@@ -1649,7 +1558,7 @@
 </file>
 
 <file path=word/header1.xml><?xml version="1.0" encoding="utf-8"?>
-<w:hdr xmlns:wpc="http://schemas.microsoft.com/office/word/2010/wordprocessingCanvas" xmlns:cx="http://schemas.microsoft.com/office/drawing/2014/chartex" xmlns:cx1="http://schemas.microsoft.com/office/drawing/2015/9/8/chartex" xmlns:cx2="http://schemas.microsoft.com/office/drawing/2015/10/21/chartex" xmlns:cx3="http://schemas.microsoft.com/office/drawing/2016/5/9/chartex" xmlns:cx4="http://schemas.microsoft.com/office/drawing/2016/5/10/chartex" xmlns:cx5="http://schemas.microsoft.com/office/drawing/2016/5/11/chartex" xmlns:cx6="http://schemas.microsoft.com/office/drawing/2016/5/12/chartex" xmlns:cx7="http://schemas.microsoft.com/office/drawing/2016/5/13/chartex" xmlns:cx8="http://schemas.microsoft.com/office/drawing/2016/5/14/chartex" xmlns:mc="http://schemas.openxmlformats.org/markup-compatibility/2006" xmlns:aink="http://schemas.microsoft.com/office/drawing/2016/ink" xmlns:am3d="http://schemas.microsoft.com/office/drawing/2017/model3d" xmlns:o="urn:schemas-microsoft-com:office:office" xmlns:oel="http://schemas.microsoft.com/office/2019/extlst" xmlns:r="http://schemas.openxmlformats.org/officeDocument/2006/relationships" xmlns:m="http://schemas.openxmlformats.org/officeDocument/2006/math" xmlns:v="urn:schemas-microsoft-com:vml" xmlns:wp14="http://schemas.microsoft.com/office/word/2010/wordprocessingDrawing" xmlns:wp="http://schemas.openxmlformats.org/drawingml/2006/wordprocessingDrawing" xmlns:w10="urn:schemas-microsoft-com:office:word" xmlns:w="http://schemas.openxmlformats.org/wordprocessingml/2006/main" xmlns:w14="http://schemas.microsoft.com/office/word/2010/wordml" xmlns:w15="http://schemas.microsoft.com/office/word/2012/wordml" xmlns:w16cex="http://schemas.microsoft.com/office/word/2018/wordml/cex" xmlns:w16cid="http://schemas.microsoft.com/office/word/2016/wordml/cid" xmlns:w16="http://schemas.microsoft.com/office/word/2018/wordml" xmlns:w16du="http://schemas.microsoft.com/office/word/2023/wordml/word16du" xmlns:w16sdtdh="http://schemas.microsoft.com/office/word/2020/wordml/sdtdatahash" xmlns:w16sdtfl="http://schemas.microsoft.com/office/word/2024/wordml/sdtformatlock" xmlns:w16se="http://schemas.microsoft.com/office/word/2015/wordml/symex" xmlns:wpg="http://schemas.microsoft.com/office/word/2010/wordprocessingGroup" xmlns:wpi="http://schemas.microsoft.com/office/word/2010/wordprocessingInk" xmlns:wne="http://schemas.microsoft.com/office/word/2006/wordml" xmlns:wps="http://schemas.microsoft.com/office/word/2010/wordprocessingShape" mc:Ignorable="w14 w15 w16se w16cid w16 w16cex w16sdtdh w16sdtfl w16du wp14">
+<w:hdr xmlns:wpc="http://schemas.microsoft.com/office/word/2010/wordprocessingCanvas" xmlns:mc="http://schemas.openxmlformats.org/markup-compatibility/2006" xmlns:o="urn:schemas-microsoft-com:office:office" xmlns:r="http://schemas.openxmlformats.org/officeDocument/2006/relationships" xmlns:m="http://schemas.openxmlformats.org/officeDocument/2006/math" xmlns:v="urn:schemas-microsoft-com:vml" xmlns:wp14="http://schemas.microsoft.com/office/word/2010/wordprocessingDrawing" xmlns:wp="http://schemas.openxmlformats.org/drawingml/2006/wordprocessingDrawing" xmlns:w10="urn:schemas-microsoft-com:office:word" xmlns:w="http://schemas.openxmlformats.org/wordprocessingml/2006/main" xmlns:w14="http://schemas.microsoft.com/office/word/2010/wordml" xmlns:w15="http://schemas.microsoft.com/office/word/2012/wordml" xmlns:w16se="http://schemas.microsoft.com/office/word/2015/wordml/symex" xmlns:w16cid="http://schemas.microsoft.com/office/word/2016/wordml/cid" xmlns:w16="http://schemas.microsoft.com/office/word/2018/wordml" xmlns:w16cex="http://schemas.microsoft.com/office/word/2018/wordml/cex" xmlns:w16sdtdh="http://schemas.microsoft.com/office/word/2020/wordml/sdtdatahash" xmlns:wne="http://schemas.microsoft.com/office/word/2006/wordml" xmlns:wpg="http://schemas.microsoft.com/office/word/2010/wordprocessingGroup" xmlns:wps="http://schemas.microsoft.com/office/word/2010/wordprocessingShape">
   <w:p>
     <w:pPr>
       <w:pStyle w:val="Encabezado"/>
@@ -1659,21 +1568,21 @@
 </file>
 
 <file path=word/header2.xml><?xml version="1.0" encoding="utf-8"?>
-<w:hdr xmlns:wpc="http://schemas.microsoft.com/office/word/2010/wordprocessingCanvas" xmlns:cx="http://schemas.microsoft.com/office/drawing/2014/chartex" xmlns:cx1="http://schemas.microsoft.com/office/drawing/2015/9/8/chartex" xmlns:cx2="http://schemas.microsoft.com/office/drawing/2015/10/21/chartex" xmlns:cx3="http://schemas.microsoft.com/office/drawing/2016/5/9/chartex" xmlns:cx4="http://schemas.microsoft.com/office/drawing/2016/5/10/chartex" xmlns:cx5="http://schemas.microsoft.com/office/drawing/2016/5/11/chartex" xmlns:cx6="http://schemas.microsoft.com/office/drawing/2016/5/12/chartex" xmlns:cx7="http://schemas.microsoft.com/office/drawing/2016/5/13/chartex" xmlns:cx8="http://schemas.microsoft.com/office/drawing/2016/5/14/chartex" xmlns:mc="http://schemas.openxmlformats.org/markup-compatibility/2006" xmlns:aink="http://schemas.microsoft.com/office/drawing/2016/ink" xmlns:am3d="http://schemas.microsoft.com/office/drawing/2017/model3d" xmlns:o="urn:schemas-microsoft-com:office:office" xmlns:oel="http://schemas.microsoft.com/office/2019/extlst" xmlns:r="http://schemas.openxmlformats.org/officeDocument/2006/relationships" xmlns:m="http://schemas.openxmlformats.org/officeDocument/2006/math" xmlns:v="urn:schemas-microsoft-com:vml" xmlns:wp14="http://schemas.microsoft.com/office/word/2010/wordprocessingDrawing" xmlns:wp="http://schemas.openxmlformats.org/drawingml/2006/wordprocessingDrawing" xmlns:w10="urn:schemas-microsoft-com:office:word" xmlns:w="http://schemas.openxmlformats.org/wordprocessingml/2006/main" xmlns:w14="http://schemas.microsoft.com/office/word/2010/wordml" xmlns:w15="http://schemas.microsoft.com/office/word/2012/wordml" xmlns:w16cex="http://schemas.microsoft.com/office/word/2018/wordml/cex" xmlns:w16cid="http://schemas.microsoft.com/office/word/2016/wordml/cid" xmlns:w16="http://schemas.microsoft.com/office/word/2018/wordml" xmlns:w16du="http://schemas.microsoft.com/office/word/2023/wordml/word16du" xmlns:w16sdtdh="http://schemas.microsoft.com/office/word/2020/wordml/sdtdatahash" xmlns:w16sdtfl="http://schemas.microsoft.com/office/word/2024/wordml/sdtformatlock" xmlns:w16se="http://schemas.microsoft.com/office/word/2015/wordml/symex" xmlns:wpg="http://schemas.microsoft.com/office/word/2010/wordprocessingGroup" xmlns:wpi="http://schemas.microsoft.com/office/word/2010/wordprocessingInk" xmlns:wne="http://schemas.microsoft.com/office/word/2006/wordml" xmlns:wps="http://schemas.microsoft.com/office/word/2010/wordprocessingShape" mc:Ignorable="w14 w15 w16se w16cid w16 w16cex w16sdtdh w16sdtfl w16du wp14">
+<w:hdr xmlns:wpc="http://schemas.microsoft.com/office/word/2010/wordprocessingCanvas" xmlns:mc="http://schemas.openxmlformats.org/markup-compatibility/2006" xmlns:o="urn:schemas-microsoft-com:office:office" xmlns:r="http://schemas.openxmlformats.org/officeDocument/2006/relationships" xmlns:m="http://schemas.openxmlformats.org/officeDocument/2006/math" xmlns:v="urn:schemas-microsoft-com:vml" xmlns:wp14="http://schemas.microsoft.com/office/word/2010/wordprocessingDrawing" xmlns:wp="http://schemas.openxmlformats.org/drawingml/2006/wordprocessingDrawing" xmlns:w10="urn:schemas-microsoft-com:office:word" xmlns:w="http://schemas.openxmlformats.org/wordprocessingml/2006/main" xmlns:w14="http://schemas.microsoft.com/office/word/2010/wordml" xmlns:w15="http://schemas.microsoft.com/office/word/2012/wordml" xmlns:w16se="http://schemas.microsoft.com/office/word/2015/wordml/symex" xmlns:w16cid="http://schemas.microsoft.com/office/word/2016/wordml/cid" xmlns:w16="http://schemas.microsoft.com/office/word/2018/wordml" xmlns:w16cex="http://schemas.microsoft.com/office/word/2018/wordml/cex" xmlns:w16sdtdh="http://schemas.microsoft.com/office/word/2020/wordml/sdtdatahash" xmlns:wne="http://schemas.microsoft.com/office/word/2006/wordml" xmlns:wpg="http://schemas.microsoft.com/office/word/2010/wordprocessingGroup" xmlns:wps="http://schemas.microsoft.com/office/word/2010/wordprocessingShape">
   <w:tbl>
     <w:tblPr>
       <w:tblStyle w:val="Tablaconcuadrcula"/>
       <w:tblW w:w="0" w:type="auto"/>
       <w:tblInd w:w="411" w:type="dxa"/>
       <w:tblBorders>
-        <w:top w:val="none" w:sz="0" w:space="0" w:color="auto"/>
-        <w:left w:val="none" w:sz="0" w:space="0" w:color="auto"/>
-        <w:bottom w:val="none" w:sz="0" w:space="0" w:color="auto"/>
-        <w:right w:val="none" w:sz="0" w:space="0" w:color="auto"/>
-        <w:insideH w:val="none" w:sz="0" w:space="0" w:color="auto"/>
-        <w:insideV w:val="none" w:sz="0" w:space="0" w:color="auto"/>
+        <w:top w:val="none"/>
+        <w:left w:val="none"/>
+        <w:bottom w:val="none"/>
+        <w:right w:val="none"/>
+        <w:insideH w:val="none"/>
+        <w:insideV w:val="none"/>
       </w:tblBorders>
-      <w:tblLook w:val="07E0" w:firstRow="1" w:lastRow="1" w:firstColumn="1" w:lastColumn="1" w:noHBand="1" w:noVBand="1"/>
+      <w:tblLook w:firstRow="1" w:lastRow="1" w:firstColumn="1" w:lastColumn="1" w:noHBand="1" w:noVBand="1"/>
     </w:tblPr>
     <w:tblGrid>
       <w:gridCol w:w="4016"/>
@@ -1698,11 +1607,8 @@
             </w:rPr>
           </w:pPr>
           <w:r>
-            <w:rPr>
-              <w:noProof/>
-            </w:rPr>
             <w:drawing>
-              <wp:inline distT="0" distB="0" distL="0" distR="0" wp14:anchorId="40A098E8" wp14:editId="6C16D9A4">
+              <wp:inline distT="0" distB="0" distL="0" distR="0">
                 <wp:extent cx="2346960" cy="910590"/>
                 <wp:effectExtent l="0" t="0" r="0" b="3810"/>
                 <wp:docPr id="2" name="image1.png"/>
@@ -1717,7 +1623,7 @@
                         <pic:cNvPicPr/>
                       </pic:nvPicPr>
                       <pic:blipFill>
-                        <a:blip r:embed="rId1"/>
+                        <a:blip r:embed="rId3"/>
                         <a:srcRect r="58181" b="72789"/>
                         <a:stretch>
                           <a:fillRect/>
@@ -1776,7 +1682,7 @@
 </file>
 
 <file path=word/header3.xml><?xml version="1.0" encoding="utf-8"?>
-<w:hdr xmlns:wpc="http://schemas.microsoft.com/office/word/2010/wordprocessingCanvas" xmlns:cx="http://schemas.microsoft.com/office/drawing/2014/chartex" xmlns:cx1="http://schemas.microsoft.com/office/drawing/2015/9/8/chartex" xmlns:cx2="http://schemas.microsoft.com/office/drawing/2015/10/21/chartex" xmlns:cx3="http://schemas.microsoft.com/office/drawing/2016/5/9/chartex" xmlns:cx4="http://schemas.microsoft.com/office/drawing/2016/5/10/chartex" xmlns:cx5="http://schemas.microsoft.com/office/drawing/2016/5/11/chartex" xmlns:cx6="http://schemas.microsoft.com/office/drawing/2016/5/12/chartex" xmlns:cx7="http://schemas.microsoft.com/office/drawing/2016/5/13/chartex" xmlns:cx8="http://schemas.microsoft.com/office/drawing/2016/5/14/chartex" xmlns:mc="http://schemas.openxmlformats.org/markup-compatibility/2006" xmlns:aink="http://schemas.microsoft.com/office/drawing/2016/ink" xmlns:am3d="http://schemas.microsoft.com/office/drawing/2017/model3d" xmlns:o="urn:schemas-microsoft-com:office:office" xmlns:oel="http://schemas.microsoft.com/office/2019/extlst" xmlns:r="http://schemas.openxmlformats.org/officeDocument/2006/relationships" xmlns:m="http://schemas.openxmlformats.org/officeDocument/2006/math" xmlns:v="urn:schemas-microsoft-com:vml" xmlns:wp14="http://schemas.microsoft.com/office/word/2010/wordprocessingDrawing" xmlns:wp="http://schemas.openxmlformats.org/drawingml/2006/wordprocessingDrawing" xmlns:w10="urn:schemas-microsoft-com:office:word" xmlns:w="http://schemas.openxmlformats.org/wordprocessingml/2006/main" xmlns:w14="http://schemas.microsoft.com/office/word/2010/wordml" xmlns:w15="http://schemas.microsoft.com/office/word/2012/wordml" xmlns:w16cex="http://schemas.microsoft.com/office/word/2018/wordml/cex" xmlns:w16cid="http://schemas.microsoft.com/office/word/2016/wordml/cid" xmlns:w16="http://schemas.microsoft.com/office/word/2018/wordml" xmlns:w16du="http://schemas.microsoft.com/office/word/2023/wordml/word16du" xmlns:w16sdtdh="http://schemas.microsoft.com/office/word/2020/wordml/sdtdatahash" xmlns:w16sdtfl="http://schemas.microsoft.com/office/word/2024/wordml/sdtformatlock" xmlns:w16se="http://schemas.microsoft.com/office/word/2015/wordml/symex" xmlns:wpg="http://schemas.microsoft.com/office/word/2010/wordprocessingGroup" xmlns:wpi="http://schemas.microsoft.com/office/word/2010/wordprocessingInk" xmlns:wne="http://schemas.microsoft.com/office/word/2006/wordml" xmlns:wps="http://schemas.microsoft.com/office/word/2010/wordprocessingShape" mc:Ignorable="w14 w15 w16se w16cid w16 w16cex w16sdtdh w16sdtfl w16du wp14">
+<w:hdr xmlns:wpc="http://schemas.microsoft.com/office/word/2010/wordprocessingCanvas" xmlns:mc="http://schemas.openxmlformats.org/markup-compatibility/2006" xmlns:o="urn:schemas-microsoft-com:office:office" xmlns:r="http://schemas.openxmlformats.org/officeDocument/2006/relationships" xmlns:m="http://schemas.openxmlformats.org/officeDocument/2006/math" xmlns:v="urn:schemas-microsoft-com:vml" xmlns:wp14="http://schemas.microsoft.com/office/word/2010/wordprocessingDrawing" xmlns:wp="http://schemas.openxmlformats.org/drawingml/2006/wordprocessingDrawing" xmlns:w10="urn:schemas-microsoft-com:office:word" xmlns:w="http://schemas.openxmlformats.org/wordprocessingml/2006/main" xmlns:w14="http://schemas.microsoft.com/office/word/2010/wordml" xmlns:w15="http://schemas.microsoft.com/office/word/2012/wordml" xmlns:w16se="http://schemas.microsoft.com/office/word/2015/wordml/symex" xmlns:w16cid="http://schemas.microsoft.com/office/word/2016/wordml/cid" xmlns:w16="http://schemas.microsoft.com/office/word/2018/wordml" xmlns:w16cex="http://schemas.microsoft.com/office/word/2018/wordml/cex" xmlns:w16sdtdh="http://schemas.microsoft.com/office/word/2020/wordml/sdtdatahash" xmlns:wne="http://schemas.microsoft.com/office/word/2006/wordml" xmlns:wpg="http://schemas.microsoft.com/office/word/2010/wordprocessingGroup" xmlns:wps="http://schemas.microsoft.com/office/word/2010/wordprocessingShape">
   <w:p>
     <w:pPr>
       <w:pStyle w:val="Encabezado"/>

</xml_diff>